<commit_message>
feat: ship WorkBuddy business acceptance flow
</commit_message>
<xml_diff>
--- a/production-library/templates/settled/product-courseware-component-v1/业务提交_空白模板.docx
+++ b/production-library/templates/settled/product-courseware-component-v1/业务提交_空白模板.docx
@@ -4,124 +4,426 @@
   <w:body>
     <w:p>
       <w:pPr>
-        <w:spacing w:after="80"/>
+        <w:spacing w:before="360" w:after="80"/>
       </w:pPr>
       <w:r>
         <w:rPr>
-          <w:rFonts w:ascii="PingFang SC" w:hAnsi="PingFang SC" w:eastAsia="PingFang SC"/>
+          <w:rFonts w:ascii="Arial Unicode MS" w:hAnsi="Arial Unicode MS" w:eastAsia="Arial Unicode MS" w:cs="Arial Unicode MS"/>
           <w:b/>
-          <w:i w:val="0"/>
-          <w:color w:val="1A2026"/>
-          <w:sz w:val="48"/>
+          <w:color w:val="2F5D7C"/>
+          <w:sz w:val="20"/>
         </w:rPr>
-        <w:t>培训课件内容与素材提交</w:t>
+        <w:t>BUSINESS INPUT · FLEXIBLE COURSEWARE</w:t>
       </w:r>
     </w:p>
     <w:p>
       <w:pPr>
-        <w:pStyle w:val="UniversalIgnore"/>
+        <w:spacing w:after="140"/>
+      </w:pPr>
+      <w:r>
+        <w:rPr>
+          <w:rFonts w:ascii="Arial Unicode MS" w:hAnsi="Arial Unicode MS" w:eastAsia="Arial Unicode MS" w:cs="Arial Unicode MS"/>
+          <w:b/>
+          <w:color w:val="25313B"/>
+          <w:sz w:val="50"/>
+        </w:rPr>
+        <w:t>灵活构件商品培训 PPT</w:t>
+        <w:br/>
+        <w:t>业务内容与素材提交</w:t>
+      </w:r>
+    </w:p>
+    <w:p>
+      <w:pPr>
         <w:spacing w:after="320"/>
       </w:pPr>
       <w:r>
         <w:rPr>
-          <w:rFonts w:ascii="PingFang SC" w:hAnsi="PingFang SC" w:eastAsia="PingFang SC"/>
-          <w:b/>
-          <w:i w:val="0"/>
-          <w:color w:val="2E74B5"/>
-          <w:sz w:val="22"/>
+          <w:rFonts w:ascii="Arial Unicode MS" w:hAnsi="Arial Unicode MS" w:eastAsia="Arial Unicode MS" w:cs="Arial Unicode MS"/>
+          <w:b w:val="0"/>
+          <w:color w:val="677682"/>
+          <w:sz w:val="26"/>
         </w:rPr>
-        <w:t>像写记事本一样整理内容，AI 负责选页型、排版和拆页。</w:t>
+        <w:t>空白模板｜按目标、内容、素材自然填写</w:t>
       </w:r>
     </w:p>
+    <w:tbl>
+      <w:tblPr>
+        <w:tblW w:type="dxa" w:w="9360"/>
+        <w:tblLayout w:type="fixed"/>
+        <w:tblLook w:firstColumn="1" w:firstRow="1" w:lastColumn="0" w:lastRow="0" w:noHBand="0" w:noVBand="1" w:val="04A0"/>
+        <w:tblInd w:w="120" w:type="dxa"/>
+        <w:tblBorders>
+          <w:top w:val="single" w:sz="5" w:color="D9E2E8"/>
+          <w:left w:val="single" w:sz="5" w:color="D9E2E8"/>
+          <w:bottom w:val="single" w:sz="5" w:color="D9E2E8"/>
+          <w:right w:val="single" w:sz="5" w:color="D9E2E8"/>
+          <w:insideH w:val="single" w:sz="5" w:color="D9E2E8"/>
+          <w:insideV w:val="single" w:sz="5" w:color="D9E2E8"/>
+        </w:tblBorders>
+      </w:tblPr>
+      <w:tblGrid>
+        <w:gridCol w:w="2400"/>
+        <w:gridCol w:w="6960"/>
+      </w:tblGrid>
+      <w:tr>
+        <w:trPr>
+          <w:cantSplit/>
+        </w:trPr>
+        <w:tc>
+          <w:tcPr>
+            <w:tcW w:type="dxa" w:w="2400"/>
+            <w:shd w:fill="EAF3F8"/>
+            <w:tcMar>
+              <w:top w:w="80" w:type="dxa"/>
+              <w:start w:w="120" w:type="dxa"/>
+              <w:bottom w:w="80" w:type="dxa"/>
+              <w:end w:w="120" w:type="dxa"/>
+            </w:tcMar>
+            <w:vAlign w:val="center"/>
+          </w:tcPr>
+          <w:p>
+            <w:pPr>
+              <w:spacing w:after="0"/>
+            </w:pPr>
+            <w:r/>
+            <w:r>
+              <w:rPr>
+                <w:rFonts w:ascii="Arial Unicode MS" w:hAnsi="Arial Unicode MS" w:eastAsia="Arial Unicode MS" w:cs="Arial Unicode MS"/>
+                <w:b/>
+                <w:color w:val="1F4661"/>
+                <w:sz w:val="20"/>
+              </w:rPr>
+              <w:t>商品 / 主题</w:t>
+            </w:r>
+          </w:p>
+        </w:tc>
+        <w:tc>
+          <w:tcPr>
+            <w:tcW w:type="dxa" w:w="6960"/>
+            <w:tcMar>
+              <w:top w:w="80" w:type="dxa"/>
+              <w:start w:w="120" w:type="dxa"/>
+              <w:bottom w:w="80" w:type="dxa"/>
+              <w:end w:w="120" w:type="dxa"/>
+            </w:tcMar>
+            <w:vAlign w:val="center"/>
+          </w:tcPr>
+          <w:p>
+            <w:pPr>
+              <w:spacing w:after="0"/>
+            </w:pPr>
+            <w:r/>
+            <w:r>
+              <w:rPr>
+                <w:rFonts w:ascii="Arial Unicode MS" w:hAnsi="Arial Unicode MS" w:eastAsia="Arial Unicode MS" w:cs="Arial Unicode MS"/>
+                <w:b w:val="0"/>
+                <w:color w:val="25313B"/>
+                <w:sz w:val="20"/>
+              </w:rPr>
+              <w:t>【请填写】</w:t>
+            </w:r>
+          </w:p>
+        </w:tc>
+      </w:tr>
+      <w:tr>
+        <w:trPr>
+          <w:cantSplit/>
+        </w:trPr>
+        <w:tc>
+          <w:tcPr>
+            <w:tcW w:type="dxa" w:w="2400"/>
+            <w:shd w:fill="EAF3F8"/>
+            <w:tcMar>
+              <w:top w:w="80" w:type="dxa"/>
+              <w:start w:w="120" w:type="dxa"/>
+              <w:bottom w:w="80" w:type="dxa"/>
+              <w:end w:w="120" w:type="dxa"/>
+            </w:tcMar>
+            <w:vAlign w:val="center"/>
+          </w:tcPr>
+          <w:p>
+            <w:pPr>
+              <w:spacing w:after="0"/>
+            </w:pPr>
+            <w:r/>
+            <w:r>
+              <w:rPr>
+                <w:rFonts w:ascii="Arial Unicode MS" w:hAnsi="Arial Unicode MS" w:eastAsia="Arial Unicode MS" w:cs="Arial Unicode MS"/>
+                <w:b/>
+                <w:color w:val="1F4661"/>
+                <w:sz w:val="20"/>
+              </w:rPr>
+              <w:t>交付目标</w:t>
+            </w:r>
+          </w:p>
+        </w:tc>
+        <w:tc>
+          <w:tcPr>
+            <w:tcW w:type="dxa" w:w="6960"/>
+            <w:tcMar>
+              <w:top w:w="80" w:type="dxa"/>
+              <w:start w:w="120" w:type="dxa"/>
+              <w:bottom w:w="80" w:type="dxa"/>
+              <w:end w:w="120" w:type="dxa"/>
+            </w:tcMar>
+            <w:vAlign w:val="center"/>
+          </w:tcPr>
+          <w:p>
+            <w:pPr>
+              <w:spacing w:after="0"/>
+            </w:pPr>
+            <w:r/>
+            <w:r>
+              <w:rPr>
+                <w:rFonts w:ascii="Arial Unicode MS" w:hAnsi="Arial Unicode MS" w:eastAsia="Arial Unicode MS" w:cs="Arial Unicode MS"/>
+                <w:b w:val="0"/>
+                <w:color w:val="25313B"/>
+                <w:sz w:val="20"/>
+              </w:rPr>
+              <w:t>【请填写：给谁用、希望学会什么】</w:t>
+            </w:r>
+          </w:p>
+        </w:tc>
+      </w:tr>
+      <w:tr>
+        <w:trPr>
+          <w:cantSplit/>
+        </w:trPr>
+        <w:tc>
+          <w:tcPr>
+            <w:tcW w:type="dxa" w:w="2400"/>
+            <w:shd w:fill="EAF3F8"/>
+            <w:tcMar>
+              <w:top w:w="80" w:type="dxa"/>
+              <w:start w:w="120" w:type="dxa"/>
+              <w:bottom w:w="80" w:type="dxa"/>
+              <w:end w:w="120" w:type="dxa"/>
+            </w:tcMar>
+            <w:vAlign w:val="center"/>
+          </w:tcPr>
+          <w:p>
+            <w:pPr>
+              <w:spacing w:after="0"/>
+            </w:pPr>
+            <w:r/>
+            <w:r>
+              <w:rPr>
+                <w:rFonts w:ascii="Arial Unicode MS" w:hAnsi="Arial Unicode MS" w:eastAsia="Arial Unicode MS" w:cs="Arial Unicode MS"/>
+                <w:b/>
+                <w:color w:val="1F4661"/>
+                <w:sz w:val="20"/>
+              </w:rPr>
+              <w:t>提交人 / 部门</w:t>
+            </w:r>
+          </w:p>
+        </w:tc>
+        <w:tc>
+          <w:tcPr>
+            <w:tcW w:type="dxa" w:w="6960"/>
+            <w:tcMar>
+              <w:top w:w="80" w:type="dxa"/>
+              <w:start w:w="120" w:type="dxa"/>
+              <w:bottom w:w="80" w:type="dxa"/>
+              <w:end w:w="120" w:type="dxa"/>
+            </w:tcMar>
+            <w:vAlign w:val="center"/>
+          </w:tcPr>
+          <w:p>
+            <w:pPr>
+              <w:spacing w:after="0"/>
+            </w:pPr>
+            <w:r/>
+            <w:r>
+              <w:rPr>
+                <w:rFonts w:ascii="Arial Unicode MS" w:hAnsi="Arial Unicode MS" w:eastAsia="Arial Unicode MS" w:cs="Arial Unicode MS"/>
+                <w:b w:val="0"/>
+                <w:color w:val="25313B"/>
+                <w:sz w:val="20"/>
+              </w:rPr>
+              <w:t>【请填写】</w:t>
+            </w:r>
+          </w:p>
+        </w:tc>
+      </w:tr>
+      <w:tr>
+        <w:trPr>
+          <w:cantSplit/>
+        </w:trPr>
+        <w:tc>
+          <w:tcPr>
+            <w:tcW w:type="dxa" w:w="2400"/>
+            <w:shd w:fill="EAF3F8"/>
+            <w:tcMar>
+              <w:top w:w="80" w:type="dxa"/>
+              <w:start w:w="120" w:type="dxa"/>
+              <w:bottom w:w="80" w:type="dxa"/>
+              <w:end w:w="120" w:type="dxa"/>
+            </w:tcMar>
+            <w:vAlign w:val="center"/>
+          </w:tcPr>
+          <w:p>
+            <w:pPr>
+              <w:spacing w:after="0"/>
+            </w:pPr>
+            <w:r/>
+            <w:r>
+              <w:rPr>
+                <w:rFonts w:ascii="Arial Unicode MS" w:hAnsi="Arial Unicode MS" w:eastAsia="Arial Unicode MS" w:cs="Arial Unicode MS"/>
+                <w:b/>
+                <w:color w:val="1F4661"/>
+                <w:sz w:val="20"/>
+              </w:rPr>
+              <w:t>版本 / 日期</w:t>
+            </w:r>
+          </w:p>
+        </w:tc>
+        <w:tc>
+          <w:tcPr>
+            <w:tcW w:type="dxa" w:w="6960"/>
+            <w:tcMar>
+              <w:top w:w="80" w:type="dxa"/>
+              <w:start w:w="120" w:type="dxa"/>
+              <w:bottom w:w="80" w:type="dxa"/>
+              <w:end w:w="120" w:type="dxa"/>
+            </w:tcMar>
+            <w:vAlign w:val="center"/>
+          </w:tcPr>
+          <w:p>
+            <w:pPr>
+              <w:spacing w:after="0"/>
+            </w:pPr>
+            <w:r/>
+            <w:r>
+              <w:rPr>
+                <w:rFonts w:ascii="Arial Unicode MS" w:hAnsi="Arial Unicode MS" w:eastAsia="Arial Unicode MS" w:cs="Arial Unicode MS"/>
+                <w:b w:val="0"/>
+                <w:color w:val="25313B"/>
+                <w:sz w:val="20"/>
+              </w:rPr>
+              <w:t>【请填写】</w:t>
+            </w:r>
+          </w:p>
+        </w:tc>
+      </w:tr>
+    </w:tbl>
+    <w:p/>
+    <w:tbl>
+      <w:tblPr>
+        <w:tblW w:type="dxa" w:w="9360"/>
+        <w:tblLayout w:type="fixed"/>
+        <w:tblLook w:firstColumn="1" w:firstRow="1" w:lastColumn="0" w:lastRow="0" w:noHBand="0" w:noVBand="1" w:val="04A0"/>
+        <w:tblInd w:w="120" w:type="dxa"/>
+      </w:tblPr>
+      <w:tblGrid>
+        <w:gridCol w:w="9360"/>
+      </w:tblGrid>
+      <w:tr>
+        <w:trPr>
+          <w:cantSplit/>
+        </w:trPr>
+        <w:tc>
+          <w:tcPr>
+            <w:tcW w:type="dxa" w:w="9360"/>
+            <w:tcMar>
+              <w:top w:w="80" w:type="dxa"/>
+              <w:start w:w="120" w:type="dxa"/>
+              <w:bottom w:w="80" w:type="dxa"/>
+              <w:end w:w="120" w:type="dxa"/>
+            </w:tcMar>
+            <w:vAlign w:val="center"/>
+            <w:shd w:fill="EAF3F8"/>
+          </w:tcPr>
+          <w:p>
+            <w:pPr>
+              <w:spacing w:after="0"/>
+            </w:pPr>
+            <w:r>
+              <w:rPr>
+                <w:rFonts w:ascii="Arial Unicode MS" w:hAnsi="Arial Unicode MS" w:eastAsia="Arial Unicode MS" w:cs="Arial Unicode MS"/>
+                <w:b/>
+                <w:color w:val="1F4661"/>
+                <w:sz w:val="21"/>
+              </w:rPr>
+              <w:t xml:space="preserve">业务只需提供  </w:t>
+            </w:r>
+            <w:r>
+              <w:rPr>
+                <w:rFonts w:ascii="Arial Unicode MS" w:hAnsi="Arial Unicode MS" w:eastAsia="Arial Unicode MS" w:cs="Arial Unicode MS"/>
+                <w:b w:val="0"/>
+                <w:color w:val="25313B"/>
+                <w:sz w:val="21"/>
+              </w:rPr>
+              <w:t>交付目标 + 已有业务内容 + 可授权素材。资料不完整可以先交，缺口明确标注即可。</w:t>
+            </w:r>
+          </w:p>
+        </w:tc>
+      </w:tr>
+    </w:tbl>
     <w:p>
       <w:pPr>
-        <w:pStyle w:val="UniversalIgnore"/>
+        <w:spacing w:after="0"/>
       </w:pPr>
-      <w:r>
-        <w:rPr>
-          <w:rFonts w:ascii="PingFang SC" w:hAnsi="PingFang SC" w:eastAsia="PingFang SC"/>
-          <w:b w:val="0"/>
-          <w:i w:val="0"/>
-          <w:color w:val="606B76"/>
-          <w:sz w:val="19"/>
-        </w:rPr>
-        <w:t>填写方法：写主题 → 按自然逻辑写板块 → 图片直接粘贴在相关板块下面。板块可自由增加或删除，不需要填写页码、模板、卡片数量或动画要求。</w:t>
-      </w:r>
     </w:p>
-    <w:p/>
+    <w:tbl>
+      <w:tblPr>
+        <w:tblW w:type="dxa" w:w="9360"/>
+        <w:tblLayout w:type="fixed"/>
+        <w:tblLook w:firstColumn="1" w:firstRow="1" w:lastColumn="0" w:lastRow="0" w:noHBand="0" w:noVBand="1" w:val="04A0"/>
+        <w:tblInd w:w="120" w:type="dxa"/>
+      </w:tblPr>
+      <w:tblGrid>
+        <w:gridCol w:w="9360"/>
+      </w:tblGrid>
+      <w:tr>
+        <w:trPr>
+          <w:cantSplit/>
+        </w:trPr>
+        <w:tc>
+          <w:tcPr>
+            <w:tcW w:type="dxa" w:w="9360"/>
+            <w:tcMar>
+              <w:top w:w="80" w:type="dxa"/>
+              <w:start w:w="120" w:type="dxa"/>
+              <w:bottom w:w="80" w:type="dxa"/>
+              <w:end w:w="120" w:type="dxa"/>
+            </w:tcMar>
+            <w:vAlign w:val="center"/>
+            <w:shd w:fill="F5F7F9"/>
+          </w:tcPr>
+          <w:p>
+            <w:pPr>
+              <w:spacing w:after="0"/>
+            </w:pPr>
+            <w:r>
+              <w:rPr>
+                <w:rFonts w:ascii="Arial Unicode MS" w:hAnsi="Arial Unicode MS" w:eastAsia="Arial Unicode MS" w:cs="Arial Unicode MS"/>
+                <w:b/>
+                <w:color w:val="1F4661"/>
+                <w:sz w:val="21"/>
+              </w:rPr>
+              <w:t xml:space="preserve">WorkBuddy 先做  </w:t>
+            </w:r>
+            <w:r>
+              <w:rPr>
+                <w:rFonts w:ascii="Arial Unicode MS" w:hAnsi="Arial Unicode MS" w:eastAsia="Arial Unicode MS" w:cs="Arial Unicode MS"/>
+                <w:b w:val="0"/>
+                <w:color w:val="25313B"/>
+                <w:sz w:val="21"/>
+              </w:rPr>
+              <w:t>先给中文页签大纲、页签能力来源解释、待补清单、素材分工和一套统一视觉方案；业务确认前不生成正式 PPTX。</w:t>
+            </w:r>
+          </w:p>
+        </w:tc>
+      </w:tr>
+    </w:tbl>
     <w:p>
       <w:pPr>
-        <w:spacing w:after="140" w:line="300" w:lineRule="auto"/>
+        <w:spacing w:after="0"/>
       </w:pPr>
-      <w:r>
-        <w:rPr>
-          <w:rFonts w:ascii="PingFang SC" w:hAnsi="PingFang SC" w:eastAsia="PingFang SC"/>
-          <w:b/>
-          <w:i w:val="0"/>
-          <w:color w:val="1A2026"/>
-          <w:sz w:val="22"/>
-        </w:rPr>
-        <w:t>课件主题：</w:t>
-      </w:r>
-      <w:r>
-        <w:rPr>
-          <w:rFonts w:ascii="PingFang SC" w:hAnsi="PingFang SC" w:eastAsia="PingFang SC"/>
-          <w:b w:val="0"/>
-          <w:i w:val="0"/>
-          <w:color w:val="606B76"/>
-          <w:sz w:val="22"/>
-        </w:rPr>
-        <w:t>请填写</w:t>
-      </w:r>
     </w:p>
     <w:p>
-      <w:pPr>
-        <w:spacing w:after="140" w:line="300" w:lineRule="auto"/>
-      </w:pPr>
       <w:r>
-        <w:rPr>
-          <w:rFonts w:ascii="PingFang SC" w:hAnsi="PingFang SC" w:eastAsia="PingFang SC"/>
-          <w:b/>
-          <w:i w:val="0"/>
-          <w:color w:val="1A2026"/>
-          <w:sz w:val="22"/>
-        </w:rPr>
-        <w:t>培训对象（可不填）：</w:t>
-      </w:r>
-      <w:r>
-        <w:rPr>
-          <w:rFonts w:ascii="PingFang SC" w:hAnsi="PingFang SC" w:eastAsia="PingFang SC"/>
-          <w:b w:val="0"/>
-          <w:i w:val="0"/>
-          <w:color w:val="606B76"/>
-          <w:sz w:val="22"/>
-        </w:rPr>
-        <w:t>请填写</w:t>
-      </w:r>
-    </w:p>
-    <w:p>
-      <w:pPr>
-        <w:spacing w:after="140" w:line="300" w:lineRule="auto"/>
-      </w:pPr>
-      <w:r>
-        <w:rPr>
-          <w:rFonts w:ascii="PingFang SC" w:hAnsi="PingFang SC" w:eastAsia="PingFang SC"/>
-          <w:b/>
-          <w:i w:val="0"/>
-          <w:color w:val="1A2026"/>
-          <w:sz w:val="22"/>
-        </w:rPr>
-        <w:t>培训目标（可不填）：</w:t>
-      </w:r>
-      <w:r>
-        <w:rPr>
-          <w:rFonts w:ascii="PingFang SC" w:hAnsi="PingFang SC" w:eastAsia="PingFang SC"/>
-          <w:b w:val="0"/>
-          <w:i w:val="0"/>
-          <w:color w:val="606B76"/>
-          <w:sz w:val="22"/>
-        </w:rPr>
-        <w:t>请填写</w:t>
+        <w:br w:type="page"/>
       </w:r>
     </w:p>
     <w:p>
@@ -129,112 +431,1728 @@
         <w:pStyle w:val="Heading1"/>
       </w:pPr>
       <w:r>
-        <w:t>板块标题（请替换）</w:t>
+        <w:t>业务怎么提交</w:t>
+      </w:r>
+    </w:p>
+    <w:tbl>
+      <w:tblPr>
+        <w:tblW w:type="dxa" w:w="9360"/>
+        <w:tblLayout w:type="fixed"/>
+        <w:tblLook w:firstColumn="1" w:firstRow="1" w:lastColumn="0" w:lastRow="0" w:noHBand="0" w:noVBand="1" w:val="04A0"/>
+        <w:tblInd w:w="120" w:type="dxa"/>
+        <w:tblBorders>
+          <w:top w:val="single" w:sz="5" w:color="D9E2E8"/>
+          <w:left w:val="single" w:sz="5" w:color="D9E2E8"/>
+          <w:bottom w:val="single" w:sz="5" w:color="D9E2E8"/>
+          <w:right w:val="single" w:sz="5" w:color="D9E2E8"/>
+          <w:insideH w:val="single" w:sz="5" w:color="D9E2E8"/>
+          <w:insideV w:val="single" w:sz="5" w:color="D9E2E8"/>
+        </w:tblBorders>
+      </w:tblPr>
+      <w:tblGrid>
+        <w:gridCol w:w="2500"/>
+        <w:gridCol w:w="6860"/>
+      </w:tblGrid>
+      <w:tr>
+        <w:trPr>
+          <w:cantSplit/>
+        </w:trPr>
+        <w:tc>
+          <w:tcPr>
+            <w:tcW w:type="dxa" w:w="2500"/>
+            <w:shd w:fill="EAF3F8"/>
+            <w:tcMar>
+              <w:top w:w="80" w:type="dxa"/>
+              <w:start w:w="120" w:type="dxa"/>
+              <w:bottom w:w="80" w:type="dxa"/>
+              <w:end w:w="120" w:type="dxa"/>
+            </w:tcMar>
+            <w:vAlign w:val="center"/>
+          </w:tcPr>
+          <w:p>
+            <w:pPr>
+              <w:spacing w:after="0"/>
+            </w:pPr>
+            <w:r/>
+            <w:r>
+              <w:rPr>
+                <w:rFonts w:ascii="Arial Unicode MS" w:hAnsi="Arial Unicode MS" w:eastAsia="Arial Unicode MS" w:cs="Arial Unicode MS"/>
+                <w:b/>
+                <w:color w:val="1F4661"/>
+                <w:sz w:val="20"/>
+              </w:rPr>
+              <w:t>01 交付目标</w:t>
+            </w:r>
+          </w:p>
+        </w:tc>
+        <w:tc>
+          <w:tcPr>
+            <w:tcW w:type="dxa" w:w="6860"/>
+            <w:tcMar>
+              <w:top w:w="80" w:type="dxa"/>
+              <w:start w:w="120" w:type="dxa"/>
+              <w:bottom w:w="80" w:type="dxa"/>
+              <w:end w:w="120" w:type="dxa"/>
+            </w:tcMar>
+            <w:vAlign w:val="center"/>
+          </w:tcPr>
+          <w:p>
+            <w:pPr>
+              <w:spacing w:after="0"/>
+            </w:pPr>
+            <w:r/>
+            <w:r>
+              <w:rPr>
+                <w:rFonts w:ascii="Arial Unicode MS" w:hAnsi="Arial Unicode MS" w:eastAsia="Arial Unicode MS" w:cs="Arial Unicode MS"/>
+                <w:b w:val="0"/>
+                <w:color w:val="25313B"/>
+                <w:sz w:val="20"/>
+              </w:rPr>
+              <w:t>说明课件给谁、用于什么场景、希望培训后完成什么动作；页数可以不填。</w:t>
+            </w:r>
+          </w:p>
+        </w:tc>
+      </w:tr>
+      <w:tr>
+        <w:trPr>
+          <w:cantSplit/>
+        </w:trPr>
+        <w:tc>
+          <w:tcPr>
+            <w:tcW w:type="dxa" w:w="2500"/>
+            <w:shd w:fill="EAF3F8"/>
+            <w:tcMar>
+              <w:top w:w="80" w:type="dxa"/>
+              <w:start w:w="120" w:type="dxa"/>
+              <w:bottom w:w="80" w:type="dxa"/>
+              <w:end w:w="120" w:type="dxa"/>
+            </w:tcMar>
+            <w:vAlign w:val="center"/>
+          </w:tcPr>
+          <w:p>
+            <w:pPr>
+              <w:spacing w:after="0"/>
+            </w:pPr>
+            <w:r/>
+            <w:r>
+              <w:rPr>
+                <w:rFonts w:ascii="Arial Unicode MS" w:hAnsi="Arial Unicode MS" w:eastAsia="Arial Unicode MS" w:cs="Arial Unicode MS"/>
+                <w:b/>
+                <w:color w:val="1F4661"/>
+                <w:sz w:val="20"/>
+              </w:rPr>
+              <w:t>02 业务内容</w:t>
+            </w:r>
+          </w:p>
+        </w:tc>
+        <w:tc>
+          <w:tcPr>
+            <w:tcW w:type="dxa" w:w="6860"/>
+            <w:tcMar>
+              <w:top w:w="80" w:type="dxa"/>
+              <w:start w:w="120" w:type="dxa"/>
+              <w:bottom w:w="80" w:type="dxa"/>
+              <w:end w:w="120" w:type="dxa"/>
+            </w:tcMar>
+            <w:vAlign w:val="center"/>
+          </w:tcPr>
+          <w:p>
+            <w:pPr>
+              <w:spacing w:after="0"/>
+            </w:pPr>
+            <w:r/>
+            <w:r>
+              <w:rPr>
+                <w:rFonts w:ascii="Arial Unicode MS" w:hAnsi="Arial Unicode MS" w:eastAsia="Arial Unicode MS" w:cs="Arial Unicode MS"/>
+                <w:b w:val="0"/>
+                <w:color w:val="25313B"/>
+                <w:sz w:val="20"/>
+              </w:rPr>
+              <w:t>粘贴已有审核稿、数据、证据与边界；不完整处写“待补”，不要为了成稿自行补写医学内容。</w:t>
+            </w:r>
+          </w:p>
+        </w:tc>
+      </w:tr>
+      <w:tr>
+        <w:trPr>
+          <w:cantSplit/>
+        </w:trPr>
+        <w:tc>
+          <w:tcPr>
+            <w:tcW w:type="dxa" w:w="2500"/>
+            <w:shd w:fill="EAF3F8"/>
+            <w:tcMar>
+              <w:top w:w="80" w:type="dxa"/>
+              <w:start w:w="120" w:type="dxa"/>
+              <w:bottom w:w="80" w:type="dxa"/>
+              <w:end w:w="120" w:type="dxa"/>
+            </w:tcMar>
+            <w:vAlign w:val="center"/>
+          </w:tcPr>
+          <w:p>
+            <w:pPr>
+              <w:spacing w:after="0"/>
+            </w:pPr>
+            <w:r/>
+            <w:r>
+              <w:rPr>
+                <w:rFonts w:ascii="Arial Unicode MS" w:hAnsi="Arial Unicode MS" w:eastAsia="Arial Unicode MS" w:cs="Arial Unicode MS"/>
+                <w:b/>
+                <w:color w:val="1F4661"/>
+                <w:sz w:val="20"/>
+              </w:rPr>
+              <w:t>03 授权素材</w:t>
+            </w:r>
+          </w:p>
+        </w:tc>
+        <w:tc>
+          <w:tcPr>
+            <w:tcW w:type="dxa" w:w="6860"/>
+            <w:tcMar>
+              <w:top w:w="80" w:type="dxa"/>
+              <w:start w:w="120" w:type="dxa"/>
+              <w:bottom w:w="80" w:type="dxa"/>
+              <w:end w:w="120" w:type="dxa"/>
+            </w:tcMar>
+            <w:vAlign w:val="center"/>
+          </w:tcPr>
+          <w:p>
+            <w:pPr>
+              <w:spacing w:after="0"/>
+            </w:pPr>
+            <w:r/>
+            <w:r>
+              <w:rPr>
+                <w:rFonts w:ascii="Arial Unicode MS" w:hAnsi="Arial Unicode MS" w:eastAsia="Arial Unicode MS" w:cs="Arial Unicode MS"/>
+                <w:b w:val="0"/>
+                <w:color w:val="25313B"/>
+                <w:sz w:val="20"/>
+              </w:rPr>
+              <w:t>包装、Logo、真实人物、门店与证据截图由业务提供来源和授权；非商品插图由 WorkBuddy 按确定页签生成或绑定。</w:t>
+            </w:r>
+          </w:p>
+        </w:tc>
+      </w:tr>
+    </w:tbl>
+    <w:p>
+      <w:pPr>
+        <w:pStyle w:val="Heading2"/>
+      </w:pPr>
+      <w:r>
+        <w:t>WorkBuddy 第一轮必须返回</w:t>
+      </w:r>
+    </w:p>
+    <w:tbl>
+      <w:tblPr>
+        <w:tblW w:type="dxa" w:w="9360"/>
+        <w:tblLayout w:type="fixed"/>
+        <w:tblLook w:firstColumn="1" w:firstRow="1" w:lastColumn="0" w:lastRow="0" w:noHBand="0" w:noVBand="1" w:val="04A0"/>
+        <w:tblInd w:w="120" w:type="dxa"/>
+        <w:tblBorders>
+          <w:top w:val="single" w:sz="5" w:color="D9E2E8"/>
+          <w:left w:val="single" w:sz="5" w:color="D9E2E8"/>
+          <w:bottom w:val="single" w:sz="5" w:color="D9E2E8"/>
+          <w:right w:val="single" w:sz="5" w:color="D9E2E8"/>
+          <w:insideH w:val="single" w:sz="5" w:color="D9E2E8"/>
+          <w:insideV w:val="single" w:sz="5" w:color="D9E2E8"/>
+        </w:tblBorders>
+      </w:tblPr>
+      <w:tblGrid>
+        <w:gridCol w:w="2350"/>
+        <w:gridCol w:w="7010"/>
+      </w:tblGrid>
+      <w:tr>
+        <w:trPr>
+          <w:cantSplit/>
+        </w:trPr>
+        <w:tc>
+          <w:tcPr>
+            <w:tcW w:type="dxa" w:w="2350"/>
+            <w:shd w:fill="F5F7F9"/>
+            <w:tcMar>
+              <w:top w:w="80" w:type="dxa"/>
+              <w:start w:w="120" w:type="dxa"/>
+              <w:bottom w:w="80" w:type="dxa"/>
+              <w:end w:w="120" w:type="dxa"/>
+            </w:tcMar>
+            <w:vAlign w:val="center"/>
+          </w:tcPr>
+          <w:p>
+            <w:pPr>
+              <w:spacing w:after="0"/>
+            </w:pPr>
+            <w:r/>
+            <w:r>
+              <w:rPr>
+                <w:rFonts w:ascii="Arial Unicode MS" w:hAnsi="Arial Unicode MS" w:eastAsia="Arial Unicode MS" w:cs="Arial Unicode MS"/>
+                <w:b/>
+                <w:color w:val="1F4661"/>
+                <w:sz w:val="19"/>
+              </w:rPr>
+              <w:t>内容初稿与缺口</w:t>
+            </w:r>
+          </w:p>
+        </w:tc>
+        <w:tc>
+          <w:tcPr>
+            <w:tcW w:type="dxa" w:w="7010"/>
+            <w:tcMar>
+              <w:top w:w="80" w:type="dxa"/>
+              <w:start w:w="120" w:type="dxa"/>
+              <w:bottom w:w="80" w:type="dxa"/>
+              <w:end w:w="120" w:type="dxa"/>
+            </w:tcMar>
+            <w:vAlign w:val="center"/>
+          </w:tcPr>
+          <w:p>
+            <w:pPr>
+              <w:spacing w:after="0"/>
+            </w:pPr>
+            <w:r/>
+            <w:r>
+              <w:rPr>
+                <w:rFonts w:ascii="Arial Unicode MS" w:hAnsi="Arial Unicode MS" w:eastAsia="Arial Unicode MS" w:cs="Arial Unicode MS"/>
+                <w:b w:val="0"/>
+                <w:color w:val="25313B"/>
+                <w:sz w:val="19"/>
+              </w:rPr>
+              <w:t>忠实整理业务原文；所有待补、待确认和证据缺口单独列出。</w:t>
+            </w:r>
+          </w:p>
+        </w:tc>
+      </w:tr>
+      <w:tr>
+        <w:trPr>
+          <w:cantSplit/>
+        </w:trPr>
+        <w:tc>
+          <w:tcPr>
+            <w:tcW w:type="dxa" w:w="2350"/>
+            <w:shd w:fill="F5F7F9"/>
+            <w:tcMar>
+              <w:top w:w="80" w:type="dxa"/>
+              <w:start w:w="120" w:type="dxa"/>
+              <w:bottom w:w="80" w:type="dxa"/>
+              <w:end w:w="120" w:type="dxa"/>
+            </w:tcMar>
+            <w:vAlign w:val="center"/>
+          </w:tcPr>
+          <w:p>
+            <w:pPr>
+              <w:spacing w:after="0"/>
+            </w:pPr>
+            <w:r/>
+            <w:r>
+              <w:rPr>
+                <w:rFonts w:ascii="Arial Unicode MS" w:hAnsi="Arial Unicode MS" w:eastAsia="Arial Unicode MS" w:cs="Arial Unicode MS"/>
+                <w:b/>
+                <w:color w:val="1F4661"/>
+                <w:sz w:val="19"/>
+              </w:rPr>
+              <w:t>中文页签大纲</w:t>
+            </w:r>
+          </w:p>
+        </w:tc>
+        <w:tc>
+          <w:tcPr>
+            <w:tcW w:type="dxa" w:w="7010"/>
+            <w:tcMar>
+              <w:top w:w="80" w:type="dxa"/>
+              <w:start w:w="120" w:type="dxa"/>
+              <w:bottom w:w="80" w:type="dxa"/>
+              <w:end w:w="120" w:type="dxa"/>
+            </w:tcMar>
+            <w:vAlign w:val="center"/>
+          </w:tcPr>
+          <w:p>
+            <w:pPr>
+              <w:spacing w:after="0"/>
+            </w:pPr>
+            <w:r/>
+            <w:r>
+              <w:rPr>
+                <w:rFonts w:ascii="Arial Unicode MS" w:hAnsi="Arial Unicode MS" w:eastAsia="Arial Unicode MS" w:cs="Arial Unicode MS"/>
+                <w:b w:val="0"/>
+                <w:color w:val="25313B"/>
+                <w:sz w:val="19"/>
+              </w:rPr>
+              <w:t>根据内容选择页签与页序，用中文说明每一页准备讲什么。</w:t>
+            </w:r>
+          </w:p>
+        </w:tc>
+      </w:tr>
+      <w:tr>
+        <w:trPr>
+          <w:cantSplit/>
+        </w:trPr>
+        <w:tc>
+          <w:tcPr>
+            <w:tcW w:type="dxa" w:w="2350"/>
+            <w:shd w:fill="F5F7F9"/>
+            <w:tcMar>
+              <w:top w:w="80" w:type="dxa"/>
+              <w:start w:w="120" w:type="dxa"/>
+              <w:bottom w:w="80" w:type="dxa"/>
+              <w:end w:w="120" w:type="dxa"/>
+            </w:tcMar>
+            <w:vAlign w:val="center"/>
+          </w:tcPr>
+          <w:p>
+            <w:pPr>
+              <w:spacing w:after="0"/>
+            </w:pPr>
+            <w:r/>
+            <w:r>
+              <w:rPr>
+                <w:rFonts w:ascii="Arial Unicode MS" w:hAnsi="Arial Unicode MS" w:eastAsia="Arial Unicode MS" w:cs="Arial Unicode MS"/>
+                <w:b/>
+                <w:color w:val="1F4661"/>
+                <w:sz w:val="19"/>
+              </w:rPr>
+              <w:t>来源解释</w:t>
+            </w:r>
+          </w:p>
+        </w:tc>
+        <w:tc>
+          <w:tcPr>
+            <w:tcW w:type="dxa" w:w="7010"/>
+            <w:tcMar>
+              <w:top w:w="80" w:type="dxa"/>
+              <w:start w:w="120" w:type="dxa"/>
+              <w:bottom w:w="80" w:type="dxa"/>
+              <w:end w:w="120" w:type="dxa"/>
+            </w:tcMar>
+            <w:vAlign w:val="center"/>
+          </w:tcPr>
+          <w:p>
+            <w:pPr>
+              <w:spacing w:after="0"/>
+            </w:pPr>
+            <w:r/>
+            <w:r>
+              <w:rPr>
+                <w:rFonts w:ascii="Arial Unicode MS" w:hAnsi="Arial Unicode MS" w:eastAsia="Arial Unicode MS" w:cs="Arial Unicode MS"/>
+                <w:b w:val="0"/>
+                <w:color w:val="25313B"/>
+                <w:sz w:val="19"/>
+              </w:rPr>
+              <w:t>说明复用了哪类已签样信息结构；只复用能力，不复制来源文案、包装、原图或配色。</w:t>
+            </w:r>
+          </w:p>
+        </w:tc>
+      </w:tr>
+      <w:tr>
+        <w:trPr>
+          <w:cantSplit/>
+        </w:trPr>
+        <w:tc>
+          <w:tcPr>
+            <w:tcW w:type="dxa" w:w="2350"/>
+            <w:shd w:fill="F5F7F9"/>
+            <w:tcMar>
+              <w:top w:w="80" w:type="dxa"/>
+              <w:start w:w="120" w:type="dxa"/>
+              <w:bottom w:w="80" w:type="dxa"/>
+              <w:end w:w="120" w:type="dxa"/>
+            </w:tcMar>
+            <w:vAlign w:val="center"/>
+          </w:tcPr>
+          <w:p>
+            <w:pPr>
+              <w:spacing w:after="0"/>
+            </w:pPr>
+            <w:r/>
+            <w:r>
+              <w:rPr>
+                <w:rFonts w:ascii="Arial Unicode MS" w:hAnsi="Arial Unicode MS" w:eastAsia="Arial Unicode MS" w:cs="Arial Unicode MS"/>
+                <w:b/>
+                <w:color w:val="1F4661"/>
+                <w:sz w:val="19"/>
+              </w:rPr>
+              <w:t>单一视觉方案</w:t>
+            </w:r>
+          </w:p>
+        </w:tc>
+        <w:tc>
+          <w:tcPr>
+            <w:tcW w:type="dxa" w:w="7010"/>
+            <w:tcMar>
+              <w:top w:w="80" w:type="dxa"/>
+              <w:start w:w="120" w:type="dxa"/>
+              <w:bottom w:w="80" w:type="dxa"/>
+              <w:end w:w="120" w:type="dxa"/>
+            </w:tcMar>
+            <w:vAlign w:val="center"/>
+          </w:tcPr>
+          <w:p>
+            <w:pPr>
+              <w:spacing w:after="0"/>
+            </w:pPr>
+            <w:r/>
+            <w:r>
+              <w:rPr>
+                <w:rFonts w:ascii="Arial Unicode MS" w:hAnsi="Arial Unicode MS" w:eastAsia="Arial Unicode MS" w:cs="Arial Unicode MS"/>
+                <w:b w:val="0"/>
+                <w:color w:val="25313B"/>
+                <w:sz w:val="19"/>
+              </w:rPr>
+              <w:t>整份课件锁定一套视觉，不因页签来自不同课型而切换风格。</w:t>
+            </w:r>
+          </w:p>
+        </w:tc>
+      </w:tr>
+      <w:tr>
+        <w:trPr>
+          <w:cantSplit/>
+        </w:trPr>
+        <w:tc>
+          <w:tcPr>
+            <w:tcW w:type="dxa" w:w="2350"/>
+            <w:shd w:fill="F5F7F9"/>
+            <w:tcMar>
+              <w:top w:w="80" w:type="dxa"/>
+              <w:start w:w="120" w:type="dxa"/>
+              <w:bottom w:w="80" w:type="dxa"/>
+              <w:end w:w="120" w:type="dxa"/>
+            </w:tcMar>
+            <w:vAlign w:val="center"/>
+          </w:tcPr>
+          <w:p>
+            <w:pPr>
+              <w:spacing w:after="0"/>
+            </w:pPr>
+            <w:r/>
+            <w:r>
+              <w:rPr>
+                <w:rFonts w:ascii="Arial Unicode MS" w:hAnsi="Arial Unicode MS" w:eastAsia="Arial Unicode MS" w:cs="Arial Unicode MS"/>
+                <w:b/>
+                <w:color w:val="1F4661"/>
+                <w:sz w:val="19"/>
+              </w:rPr>
+              <w:t>素材分工</w:t>
+            </w:r>
+          </w:p>
+        </w:tc>
+        <w:tc>
+          <w:tcPr>
+            <w:tcW w:type="dxa" w:w="7010"/>
+            <w:tcMar>
+              <w:top w:w="80" w:type="dxa"/>
+              <w:start w:w="120" w:type="dxa"/>
+              <w:bottom w:w="80" w:type="dxa"/>
+              <w:end w:w="120" w:type="dxa"/>
+            </w:tcMar>
+            <w:vAlign w:val="center"/>
+          </w:tcPr>
+          <w:p>
+            <w:pPr>
+              <w:spacing w:after="0"/>
+            </w:pPr>
+            <w:r/>
+            <w:r>
+              <w:rPr>
+                <w:rFonts w:ascii="Arial Unicode MS" w:hAnsi="Arial Unicode MS" w:eastAsia="Arial Unicode MS" w:cs="Arial Unicode MS"/>
+                <w:b w:val="0"/>
+                <w:color w:val="25313B"/>
+                <w:sz w:val="19"/>
+              </w:rPr>
+              <w:t>逐项区分业务必须提供的授权素材与 WorkBuddy 可生成/绑定的非商品插图。</w:t>
+            </w:r>
+          </w:p>
+        </w:tc>
+      </w:tr>
+    </w:tbl>
+    <w:p/>
+    <w:tbl>
+      <w:tblPr>
+        <w:tblW w:type="dxa" w:w="9360"/>
+        <w:tblLayout w:type="fixed"/>
+        <w:tblLook w:firstColumn="1" w:firstRow="1" w:lastColumn="0" w:lastRow="0" w:noHBand="0" w:noVBand="1" w:val="04A0"/>
+        <w:tblInd w:w="120" w:type="dxa"/>
+      </w:tblPr>
+      <w:tblGrid>
+        <w:gridCol w:w="9360"/>
+      </w:tblGrid>
+      <w:tr>
+        <w:trPr>
+          <w:cantSplit/>
+        </w:trPr>
+        <w:tc>
+          <w:tcPr>
+            <w:tcW w:type="dxa" w:w="9360"/>
+            <w:tcMar>
+              <w:top w:w="80" w:type="dxa"/>
+              <w:start w:w="120" w:type="dxa"/>
+              <w:bottom w:w="80" w:type="dxa"/>
+              <w:end w:w="120" w:type="dxa"/>
+            </w:tcMar>
+            <w:vAlign w:val="center"/>
+            <w:shd w:fill="EAF3F8"/>
+          </w:tcPr>
+          <w:p>
+            <w:pPr>
+              <w:spacing w:after="0"/>
+            </w:pPr>
+            <w:r>
+              <w:rPr>
+                <w:rFonts w:ascii="Arial Unicode MS" w:hAnsi="Arial Unicode MS" w:eastAsia="Arial Unicode MS" w:cs="Arial Unicode MS"/>
+                <w:b/>
+                <w:color w:val="1F4661"/>
+                <w:sz w:val="21"/>
+              </w:rPr>
+              <w:t xml:space="preserve">确认顺序  </w:t>
+            </w:r>
+            <w:r>
+              <w:rPr>
+                <w:rFonts w:ascii="Arial Unicode MS" w:hAnsi="Arial Unicode MS" w:eastAsia="Arial Unicode MS" w:cs="Arial Unicode MS"/>
+                <w:b w:val="0"/>
+                <w:color w:val="25313B"/>
+                <w:sz w:val="21"/>
+              </w:rPr>
+              <w:t>内容与中文页签 → 视觉与非商品插图绑定 → 正式商品图及授权 → 正式 PPTX → 逐页 QA。任何已确认载荷发生变化，都要重新确认。</w:t>
+            </w:r>
+          </w:p>
+        </w:tc>
+      </w:tr>
+    </w:tbl>
+    <w:p>
+      <w:pPr>
+        <w:spacing w:after="0"/>
+      </w:pPr>
+    </w:p>
+    <w:tbl>
+      <w:tblPr>
+        <w:tblW w:type="dxa" w:w="9360"/>
+        <w:tblLayout w:type="fixed"/>
+        <w:tblLook w:firstColumn="1" w:firstRow="1" w:lastColumn="0" w:lastRow="0" w:noHBand="0" w:noVBand="1" w:val="04A0"/>
+        <w:tblInd w:w="120" w:type="dxa"/>
+      </w:tblPr>
+      <w:tblGrid>
+        <w:gridCol w:w="9360"/>
+      </w:tblGrid>
+      <w:tr>
+        <w:trPr>
+          <w:cantSplit/>
+        </w:trPr>
+        <w:tc>
+          <w:tcPr>
+            <w:tcW w:type="dxa" w:w="9360"/>
+            <w:tcMar>
+              <w:top w:w="80" w:type="dxa"/>
+              <w:start w:w="120" w:type="dxa"/>
+              <w:bottom w:w="80" w:type="dxa"/>
+              <w:end w:w="120" w:type="dxa"/>
+            </w:tcMar>
+            <w:vAlign w:val="center"/>
+            <w:shd w:fill="F5F7F9"/>
+          </w:tcPr>
+          <w:p>
+            <w:pPr>
+              <w:spacing w:after="0"/>
+            </w:pPr>
+            <w:r>
+              <w:rPr>
+                <w:rFonts w:ascii="Arial Unicode MS" w:hAnsi="Arial Unicode MS" w:eastAsia="Arial Unicode MS" w:cs="Arial Unicode MS"/>
+                <w:b/>
+                <w:color w:val="1F4661"/>
+                <w:sz w:val="21"/>
+              </w:rPr>
+              <w:t xml:space="preserve">业务无需做  </w:t>
+            </w:r>
+            <w:r>
+              <w:rPr>
+                <w:rFonts w:ascii="Arial Unicode MS" w:hAnsi="Arial Unicode MS" w:eastAsia="Arial Unicode MS" w:cs="Arial Unicode MS"/>
+                <w:b w:val="0"/>
+                <w:color w:val="25313B"/>
+                <w:sz w:val="21"/>
+              </w:rPr>
+              <w:t>无需选择“默认路线”，无需填写内部 JSON、页型 ID、坐标、卡片数量或生成命令。</w:t>
+            </w:r>
+          </w:p>
+        </w:tc>
+      </w:tr>
+    </w:tbl>
+    <w:p>
+      <w:pPr>
+        <w:spacing w:after="0"/>
+      </w:pPr>
+    </w:p>
+    <w:p>
+      <w:r>
+        <w:br w:type="page"/>
       </w:r>
     </w:p>
     <w:p>
       <w:pPr>
-        <w:spacing w:after="120" w:line="300" w:lineRule="auto"/>
+        <w:pStyle w:val="Heading1"/>
       </w:pPr>
       <w:r>
-        <w:rPr>
-          <w:rFonts w:ascii="PingFang SC" w:hAnsi="PingFang SC" w:eastAsia="PingFang SC"/>
-          <w:b w:val="0"/>
-          <w:i/>
-          <w:color w:val="606B76"/>
-          <w:sz w:val="22"/>
-        </w:rPr>
-        <w:t>在这里直接写本板块的审核内容。可以分段，也可以列出若干要点；有几条就写几条，不需要凑数量。</w:t>
+        <w:t>业务填写区</w:t>
+      </w:r>
+    </w:p>
+    <w:tbl>
+      <w:tblPr>
+        <w:tblW w:type="dxa" w:w="9360"/>
+        <w:tblLayout w:type="fixed"/>
+        <w:tblLook w:firstColumn="1" w:firstRow="1" w:lastColumn="0" w:lastRow="0" w:noHBand="0" w:noVBand="1" w:val="04A0"/>
+        <w:tblInd w:w="120" w:type="dxa"/>
+        <w:tblBorders>
+          <w:top w:val="single" w:sz="5" w:color="D9E2E8"/>
+          <w:left w:val="single" w:sz="5" w:color="D9E2E8"/>
+          <w:bottom w:val="single" w:sz="5" w:color="D9E2E8"/>
+          <w:right w:val="single" w:sz="5" w:color="D9E2E8"/>
+          <w:insideH w:val="single" w:sz="5" w:color="D9E2E8"/>
+          <w:insideV w:val="single" w:sz="5" w:color="D9E2E8"/>
+        </w:tblBorders>
+      </w:tblPr>
+      <w:tblGrid>
+        <w:gridCol w:w="2500"/>
+        <w:gridCol w:w="6860"/>
+      </w:tblGrid>
+      <w:tr>
+        <w:trPr>
+          <w:cantSplit/>
+        </w:trPr>
+        <w:tc>
+          <w:tcPr>
+            <w:tcW w:type="dxa" w:w="2500"/>
+            <w:shd w:fill="EAF3F8"/>
+            <w:tcMar>
+              <w:top w:w="80" w:type="dxa"/>
+              <w:start w:w="120" w:type="dxa"/>
+              <w:bottom w:w="80" w:type="dxa"/>
+              <w:end w:w="120" w:type="dxa"/>
+            </w:tcMar>
+            <w:vAlign w:val="center"/>
+          </w:tcPr>
+          <w:p>
+            <w:pPr>
+              <w:spacing w:after="0"/>
+            </w:pPr>
+            <w:r/>
+            <w:r>
+              <w:rPr>
+                <w:rFonts w:ascii="Arial Unicode MS" w:hAnsi="Arial Unicode MS" w:eastAsia="Arial Unicode MS" w:cs="Arial Unicode MS"/>
+                <w:b/>
+                <w:color w:val="1F4661"/>
+                <w:sz w:val="19"/>
+              </w:rPr>
+              <w:t>培训对象与场景</w:t>
+            </w:r>
+          </w:p>
+        </w:tc>
+        <w:tc>
+          <w:tcPr>
+            <w:tcW w:type="dxa" w:w="6860"/>
+            <w:tcMar>
+              <w:top w:w="80" w:type="dxa"/>
+              <w:start w:w="120" w:type="dxa"/>
+              <w:bottom w:w="80" w:type="dxa"/>
+              <w:end w:w="120" w:type="dxa"/>
+            </w:tcMar>
+            <w:vAlign w:val="center"/>
+          </w:tcPr>
+          <w:p>
+            <w:pPr>
+              <w:spacing w:after="0"/>
+            </w:pPr>
+            <w:r/>
+            <w:r>
+              <w:rPr>
+                <w:rFonts w:ascii="Arial Unicode MS" w:hAnsi="Arial Unicode MS" w:eastAsia="Arial Unicode MS" w:cs="Arial Unicode MS"/>
+                <w:b w:val="0"/>
+                <w:color w:val="25313B"/>
+                <w:sz w:val="19"/>
+              </w:rPr>
+              <w:t>【请填写：谁会使用、在什么场景使用】</w:t>
+            </w:r>
+          </w:p>
+        </w:tc>
+      </w:tr>
+      <w:tr>
+        <w:trPr>
+          <w:cantSplit/>
+        </w:trPr>
+        <w:tc>
+          <w:tcPr>
+            <w:tcW w:type="dxa" w:w="2500"/>
+            <w:shd w:fill="EAF3F8"/>
+            <w:tcMar>
+              <w:top w:w="80" w:type="dxa"/>
+              <w:start w:w="120" w:type="dxa"/>
+              <w:bottom w:w="80" w:type="dxa"/>
+              <w:end w:w="120" w:type="dxa"/>
+            </w:tcMar>
+            <w:vAlign w:val="center"/>
+          </w:tcPr>
+          <w:p>
+            <w:pPr>
+              <w:spacing w:after="0"/>
+            </w:pPr>
+            <w:r/>
+            <w:r>
+              <w:rPr>
+                <w:rFonts w:ascii="Arial Unicode MS" w:hAnsi="Arial Unicode MS" w:eastAsia="Arial Unicode MS" w:cs="Arial Unicode MS"/>
+                <w:b/>
+                <w:color w:val="1F4661"/>
+                <w:sz w:val="19"/>
+              </w:rPr>
+              <w:t>交付目标</w:t>
+            </w:r>
+          </w:p>
+        </w:tc>
+        <w:tc>
+          <w:tcPr>
+            <w:tcW w:type="dxa" w:w="6860"/>
+            <w:tcMar>
+              <w:top w:w="80" w:type="dxa"/>
+              <w:start w:w="120" w:type="dxa"/>
+              <w:bottom w:w="80" w:type="dxa"/>
+              <w:end w:w="120" w:type="dxa"/>
+            </w:tcMar>
+            <w:vAlign w:val="center"/>
+          </w:tcPr>
+          <w:p>
+            <w:pPr>
+              <w:spacing w:after="0"/>
+            </w:pPr>
+            <w:r/>
+            <w:r>
+              <w:rPr>
+                <w:rFonts w:ascii="Arial Unicode MS" w:hAnsi="Arial Unicode MS" w:eastAsia="Arial Unicode MS" w:cs="Arial Unicode MS"/>
+                <w:b w:val="0"/>
+                <w:color w:val="25313B"/>
+                <w:sz w:val="19"/>
+              </w:rPr>
+              <w:t>【请填写：希望培训后能完成什么】</w:t>
+            </w:r>
+          </w:p>
+        </w:tc>
+      </w:tr>
+      <w:tr>
+        <w:trPr>
+          <w:cantSplit/>
+        </w:trPr>
+        <w:tc>
+          <w:tcPr>
+            <w:tcW w:type="dxa" w:w="2500"/>
+            <w:shd w:fill="EAF3F8"/>
+            <w:tcMar>
+              <w:top w:w="80" w:type="dxa"/>
+              <w:start w:w="120" w:type="dxa"/>
+              <w:bottom w:w="80" w:type="dxa"/>
+              <w:end w:w="120" w:type="dxa"/>
+            </w:tcMar>
+            <w:vAlign w:val="center"/>
+          </w:tcPr>
+          <w:p>
+            <w:pPr>
+              <w:spacing w:after="0"/>
+            </w:pPr>
+            <w:r/>
+            <w:r>
+              <w:rPr>
+                <w:rFonts w:ascii="Arial Unicode MS" w:hAnsi="Arial Unicode MS" w:eastAsia="Arial Unicode MS" w:cs="Arial Unicode MS"/>
+                <w:b/>
+                <w:color w:val="1F4661"/>
+                <w:sz w:val="19"/>
+              </w:rPr>
+              <w:t>篇幅 / 节奏</w:t>
+            </w:r>
+          </w:p>
+        </w:tc>
+        <w:tc>
+          <w:tcPr>
+            <w:tcW w:type="dxa" w:w="6860"/>
+            <w:tcMar>
+              <w:top w:w="80" w:type="dxa"/>
+              <w:start w:w="120" w:type="dxa"/>
+              <w:bottom w:w="80" w:type="dxa"/>
+              <w:end w:w="120" w:type="dxa"/>
+            </w:tcMar>
+            <w:vAlign w:val="center"/>
+          </w:tcPr>
+          <w:p>
+            <w:pPr>
+              <w:spacing w:after="0"/>
+            </w:pPr>
+            <w:r/>
+            <w:r>
+              <w:rPr>
+                <w:rFonts w:ascii="Arial Unicode MS" w:hAnsi="Arial Unicode MS" w:eastAsia="Arial Unicode MS" w:cs="Arial Unicode MS"/>
+                <w:b w:val="0"/>
+                <w:color w:val="25313B"/>
+                <w:sz w:val="19"/>
+              </w:rPr>
+              <w:t>【可不填；由 WorkBuddy 根据内容建议】</w:t>
+            </w:r>
+          </w:p>
+        </w:tc>
+      </w:tr>
+      <w:tr>
+        <w:trPr>
+          <w:cantSplit/>
+        </w:trPr>
+        <w:tc>
+          <w:tcPr>
+            <w:tcW w:type="dxa" w:w="2500"/>
+            <w:shd w:fill="EAF3F8"/>
+            <w:tcMar>
+              <w:top w:w="80" w:type="dxa"/>
+              <w:start w:w="120" w:type="dxa"/>
+              <w:bottom w:w="80" w:type="dxa"/>
+              <w:end w:w="120" w:type="dxa"/>
+            </w:tcMar>
+            <w:vAlign w:val="center"/>
+          </w:tcPr>
+          <w:p>
+            <w:pPr>
+              <w:spacing w:after="0"/>
+            </w:pPr>
+            <w:r/>
+            <w:r>
+              <w:rPr>
+                <w:rFonts w:ascii="Arial Unicode MS" w:hAnsi="Arial Unicode MS" w:eastAsia="Arial Unicode MS" w:cs="Arial Unicode MS"/>
+                <w:b/>
+                <w:color w:val="1F4661"/>
+                <w:sz w:val="19"/>
+              </w:rPr>
+              <w:t>不能出现</w:t>
+            </w:r>
+          </w:p>
+        </w:tc>
+        <w:tc>
+          <w:tcPr>
+            <w:tcW w:type="dxa" w:w="6860"/>
+            <w:tcMar>
+              <w:top w:w="80" w:type="dxa"/>
+              <w:start w:w="120" w:type="dxa"/>
+              <w:bottom w:w="80" w:type="dxa"/>
+              <w:end w:w="120" w:type="dxa"/>
+            </w:tcMar>
+            <w:vAlign w:val="center"/>
+          </w:tcPr>
+          <w:p>
+            <w:pPr>
+              <w:spacing w:after="0"/>
+            </w:pPr>
+            <w:r/>
+            <w:r>
+              <w:rPr>
+                <w:rFonts w:ascii="Arial Unicode MS" w:hAnsi="Arial Unicode MS" w:eastAsia="Arial Unicode MS" w:cs="Arial Unicode MS"/>
+                <w:b w:val="0"/>
+                <w:color w:val="25313B"/>
+                <w:sz w:val="19"/>
+              </w:rPr>
+              <w:t>【可不填：禁用说法、品牌边界、合规边界】</w:t>
+            </w:r>
+          </w:p>
+        </w:tc>
+      </w:tr>
+    </w:tbl>
+    <w:p>
+      <w:pPr>
+        <w:pStyle w:val="Heading2"/>
+      </w:pPr>
+      <w:r>
+        <w:t>业务内容（按自然逻辑写，不限栏目）</w:t>
       </w:r>
     </w:p>
     <w:p>
       <w:pPr>
-        <w:spacing w:after="120"/>
+        <w:pStyle w:val="Heading3"/>
       </w:pPr>
       <w:r>
-        <w:rPr>
-          <w:rFonts w:ascii="PingFang SC" w:hAnsi="PingFang SC" w:eastAsia="PingFang SC"/>
-          <w:b w:val="0"/>
-          <w:i w:val="0"/>
-          <w:color w:val="1A2026"/>
-          <w:sz w:val="22"/>
-        </w:rPr>
-        <w:t xml:space="preserve"> </w:t>
+        <w:t>板块标题（自行命名，可复制或删除）</w:t>
       </w:r>
     </w:p>
     <w:p>
       <w:pPr>
-        <w:spacing w:after="120"/>
+        <w:spacing w:after="100"/>
+        <w:ind w:left="173"/>
       </w:pPr>
       <w:r>
-        <w:rPr>
-          <w:rFonts w:ascii="PingFang SC" w:hAnsi="PingFang SC" w:eastAsia="PingFang SC"/>
-          <w:b w:val="0"/>
-          <w:i w:val="0"/>
-          <w:color w:val="1A2026"/>
-          <w:sz w:val="22"/>
-        </w:rPr>
-        <w:t xml:space="preserve"> </w:t>
+        <w:t>【粘贴审核内容、数据、边界和证据；有几条写几条，缺失处写“待补”】</w:t>
       </w:r>
     </w:p>
     <w:p>
       <w:pPr>
-        <w:spacing w:before="80" w:after="80"/>
+        <w:pStyle w:val="Heading3"/>
       </w:pPr>
       <w:r>
-        <w:rPr>
-          <w:rFonts w:ascii="PingFang SC" w:hAnsi="PingFang SC" w:eastAsia="PingFang SC"/>
-          <w:b w:val="0"/>
-          <w:i/>
-          <w:color w:val="606B76"/>
-          <w:sz w:val="20"/>
-        </w:rPr>
-        <w:t>【在此处直接粘贴与本板块相关的图片；没有图片可删除本行】</w:t>
+        <w:t>下一个板块标题（自行命名，可复制或删除）</w:t>
       </w:r>
     </w:p>
     <w:p>
       <w:pPr>
-        <w:spacing w:after="280"/>
+        <w:spacing w:after="100"/>
+        <w:ind w:left="173"/>
       </w:pPr>
       <w:r>
-        <w:rPr>
-          <w:rFonts w:ascii="PingFang SC" w:hAnsi="PingFang SC" w:eastAsia="PingFang SC"/>
-          <w:b/>
-          <w:i w:val="0"/>
-          <w:color w:val="1A2026"/>
-          <w:sz w:val="20"/>
-        </w:rPr>
-        <w:t>图片说明／来源（可不填）：</w:t>
+        <w:t>【继续按业务逻辑填写；不需要对应固定六栏目，也不需要写页码】</w:t>
       </w:r>
+    </w:p>
+    <w:tbl>
+      <w:tblPr>
+        <w:tblW w:type="dxa" w:w="9360"/>
+        <w:tblLayout w:type="fixed"/>
+        <w:tblLook w:firstColumn="1" w:firstRow="1" w:lastColumn="0" w:lastRow="0" w:noHBand="0" w:noVBand="1" w:val="04A0"/>
+        <w:tblInd w:w="120" w:type="dxa"/>
+      </w:tblPr>
+      <w:tblGrid>
+        <w:gridCol w:w="9360"/>
+      </w:tblGrid>
+      <w:tr>
+        <w:trPr>
+          <w:cantSplit/>
+        </w:trPr>
+        <w:tc>
+          <w:tcPr>
+            <w:tcW w:type="dxa" w:w="9360"/>
+            <w:tcMar>
+              <w:top w:w="80" w:type="dxa"/>
+              <w:start w:w="120" w:type="dxa"/>
+              <w:bottom w:w="80" w:type="dxa"/>
+              <w:end w:w="120" w:type="dxa"/>
+            </w:tcMar>
+            <w:vAlign w:val="center"/>
+            <w:shd w:fill="F5F7F9"/>
+          </w:tcPr>
+          <w:p>
+            <w:pPr>
+              <w:spacing w:after="0"/>
+            </w:pPr>
+            <w:r>
+              <w:rPr>
+                <w:rFonts w:ascii="Arial Unicode MS" w:hAnsi="Arial Unicode MS" w:eastAsia="Arial Unicode MS" w:cs="Arial Unicode MS"/>
+                <w:b/>
+                <w:color w:val="1F4661"/>
+                <w:sz w:val="21"/>
+              </w:rPr>
+              <w:t xml:space="preserve">内容边界  </w:t>
+            </w:r>
+            <w:r>
+              <w:rPr>
+                <w:rFonts w:ascii="Arial Unicode MS" w:hAnsi="Arial Unicode MS" w:eastAsia="Arial Unicode MS" w:cs="Arial Unicode MS"/>
+                <w:b w:val="0"/>
+                <w:color w:val="25313B"/>
+                <w:sz w:val="21"/>
+              </w:rPr>
+              <w:t>WorkBuddy 可以整理、拆分和发现缺口，但不得自行编写医学功效、用法用量、联合推荐或业务未提供的结论。</w:t>
+            </w:r>
+          </w:p>
+        </w:tc>
+      </w:tr>
+    </w:tbl>
+    <w:p>
+      <w:pPr>
+        <w:spacing w:after="0"/>
+      </w:pPr>
+    </w:p>
+    <w:p>
       <w:r>
-        <w:rPr>
-          <w:rFonts w:ascii="PingFang SC" w:hAnsi="PingFang SC" w:eastAsia="PingFang SC"/>
-          <w:b w:val="0"/>
-          <w:i w:val="0"/>
-          <w:color w:val="606B76"/>
-          <w:sz w:val="20"/>
-        </w:rPr>
-        <w:t xml:space="preserve"> </w:t>
+        <w:br w:type="page"/>
       </w:r>
     </w:p>
     <w:p>
       <w:pPr>
-        <w:pStyle w:val="UniversalIgnore"/>
-        <w:spacing w:before="160"/>
+        <w:pStyle w:val="Heading1"/>
       </w:pPr>
       <w:r>
-        <w:rPr>
-          <w:rFonts w:ascii="PingFang SC" w:hAnsi="PingFang SC" w:eastAsia="PingFang SC"/>
-          <w:b w:val="0"/>
-          <w:i/>
-          <w:color w:val="606B76"/>
-          <w:sz w:val="19"/>
-        </w:rPr>
-        <w:t>需要更多板块时，复制上面的“板块标题＋内容＋图片”整段继续填写；不需要的板块直接删除。</w:t>
+        <w:t>素材与授权</w:t>
+      </w:r>
+    </w:p>
+    <w:tbl>
+      <w:tblPr>
+        <w:tblW w:type="dxa" w:w="9360"/>
+        <w:tblLayout w:type="fixed"/>
+        <w:tblLook w:firstColumn="1" w:firstRow="1" w:lastColumn="0" w:lastRow="0" w:noHBand="0" w:noVBand="1" w:val="04A0"/>
+        <w:tblInd w:w="120" w:type="dxa"/>
+        <w:tblBorders>
+          <w:top w:val="single" w:sz="5" w:color="D9E2E8"/>
+          <w:left w:val="single" w:sz="5" w:color="D9E2E8"/>
+          <w:bottom w:val="single" w:sz="5" w:color="D9E2E8"/>
+          <w:right w:val="single" w:sz="5" w:color="D9E2E8"/>
+          <w:insideH w:val="single" w:sz="5" w:color="D9E2E8"/>
+          <w:insideV w:val="single" w:sz="5" w:color="D9E2E8"/>
+        </w:tblBorders>
+      </w:tblPr>
+      <w:tblGrid>
+        <w:gridCol w:w="1850"/>
+        <w:gridCol w:w="1750"/>
+        <w:gridCol w:w="2750"/>
+        <w:gridCol w:w="3010"/>
+      </w:tblGrid>
+      <w:tr>
+        <w:trPr>
+          <w:cantSplit/>
+        </w:trPr>
+        <w:tc>
+          <w:tcPr>
+            <w:tcW w:type="dxa" w:w="1850"/>
+            <w:shd w:fill="EAF3F8"/>
+            <w:tcMar>
+              <w:top w:w="80" w:type="dxa"/>
+              <w:start w:w="120" w:type="dxa"/>
+              <w:bottom w:w="80" w:type="dxa"/>
+              <w:end w:w="120" w:type="dxa"/>
+            </w:tcMar>
+            <w:vAlign w:val="center"/>
+          </w:tcPr>
+          <w:p>
+            <w:pPr>
+              <w:spacing w:after="0"/>
+            </w:pPr>
+            <w:r/>
+            <w:r>
+              <w:rPr>
+                <w:rFonts w:ascii="Arial Unicode MS" w:hAnsi="Arial Unicode MS" w:eastAsia="Arial Unicode MS" w:cs="Arial Unicode MS"/>
+                <w:b/>
+                <w:color w:val="1F4661"/>
+                <w:sz w:val="18"/>
+              </w:rPr>
+              <w:t>素材</w:t>
+            </w:r>
+          </w:p>
+        </w:tc>
+        <w:tc>
+          <w:tcPr>
+            <w:tcW w:type="dxa" w:w="1750"/>
+            <w:shd w:fill="EAF3F8"/>
+            <w:tcMar>
+              <w:top w:w="80" w:type="dxa"/>
+              <w:start w:w="120" w:type="dxa"/>
+              <w:bottom w:w="80" w:type="dxa"/>
+              <w:end w:w="120" w:type="dxa"/>
+            </w:tcMar>
+            <w:vAlign w:val="center"/>
+          </w:tcPr>
+          <w:p>
+            <w:pPr>
+              <w:spacing w:after="0"/>
+            </w:pPr>
+            <w:r/>
+            <w:r>
+              <w:rPr>
+                <w:rFonts w:ascii="Arial Unicode MS" w:hAnsi="Arial Unicode MS" w:eastAsia="Arial Unicode MS" w:cs="Arial Unicode MS"/>
+                <w:b/>
+                <w:color w:val="1F4661"/>
+                <w:sz w:val="18"/>
+              </w:rPr>
+              <w:t>由谁提供</w:t>
+            </w:r>
+          </w:p>
+        </w:tc>
+        <w:tc>
+          <w:tcPr>
+            <w:tcW w:type="dxa" w:w="2750"/>
+            <w:shd w:fill="EAF3F8"/>
+            <w:tcMar>
+              <w:top w:w="80" w:type="dxa"/>
+              <w:start w:w="120" w:type="dxa"/>
+              <w:bottom w:w="80" w:type="dxa"/>
+              <w:end w:w="120" w:type="dxa"/>
+            </w:tcMar>
+            <w:vAlign w:val="center"/>
+          </w:tcPr>
+          <w:p>
+            <w:pPr>
+              <w:spacing w:after="0"/>
+            </w:pPr>
+            <w:r/>
+            <w:r>
+              <w:rPr>
+                <w:rFonts w:ascii="Arial Unicode MS" w:hAnsi="Arial Unicode MS" w:eastAsia="Arial Unicode MS" w:cs="Arial Unicode MS"/>
+                <w:b/>
+                <w:color w:val="1F4661"/>
+                <w:sz w:val="18"/>
+              </w:rPr>
+              <w:t>来源 / 授权</w:t>
+            </w:r>
+          </w:p>
+        </w:tc>
+        <w:tc>
+          <w:tcPr>
+            <w:tcW w:type="dxa" w:w="3010"/>
+            <w:shd w:fill="EAF3F8"/>
+            <w:tcMar>
+              <w:top w:w="80" w:type="dxa"/>
+              <w:start w:w="120" w:type="dxa"/>
+              <w:bottom w:w="80" w:type="dxa"/>
+              <w:end w:w="120" w:type="dxa"/>
+            </w:tcMar>
+            <w:vAlign w:val="center"/>
+          </w:tcPr>
+          <w:p>
+            <w:pPr>
+              <w:spacing w:after="0"/>
+            </w:pPr>
+            <w:r/>
+            <w:r>
+              <w:rPr>
+                <w:rFonts w:ascii="Arial Unicode MS" w:hAnsi="Arial Unicode MS" w:eastAsia="Arial Unicode MS" w:cs="Arial Unicode MS"/>
+                <w:b/>
+                <w:color w:val="1F4661"/>
+                <w:sz w:val="18"/>
+              </w:rPr>
+              <w:t>用途或说明</w:t>
+            </w:r>
+          </w:p>
+        </w:tc>
+      </w:tr>
+      <w:tr>
+        <w:trPr>
+          <w:cantSplit/>
+        </w:trPr>
+        <w:tc>
+          <w:tcPr>
+            <w:tcW w:type="dxa" w:w="1850"/>
+            <w:tcMar>
+              <w:top w:w="80" w:type="dxa"/>
+              <w:start w:w="120" w:type="dxa"/>
+              <w:bottom w:w="80" w:type="dxa"/>
+              <w:end w:w="120" w:type="dxa"/>
+            </w:tcMar>
+            <w:vAlign w:val="center"/>
+          </w:tcPr>
+          <w:p>
+            <w:pPr>
+              <w:spacing w:after="0"/>
+            </w:pPr>
+            <w:r/>
+            <w:r>
+              <w:rPr>
+                <w:rFonts w:ascii="Arial Unicode MS" w:hAnsi="Arial Unicode MS" w:eastAsia="Arial Unicode MS" w:cs="Arial Unicode MS"/>
+                <w:b w:val="0"/>
+                <w:color w:val="25313B"/>
+                <w:sz w:val="18"/>
+              </w:rPr>
+              <w:t>【素材名称】</w:t>
+            </w:r>
+          </w:p>
+        </w:tc>
+        <w:tc>
+          <w:tcPr>
+            <w:tcW w:type="dxa" w:w="1750"/>
+            <w:tcMar>
+              <w:top w:w="80" w:type="dxa"/>
+              <w:start w:w="120" w:type="dxa"/>
+              <w:bottom w:w="80" w:type="dxa"/>
+              <w:end w:w="120" w:type="dxa"/>
+            </w:tcMar>
+            <w:vAlign w:val="center"/>
+          </w:tcPr>
+          <w:p>
+            <w:pPr>
+              <w:spacing w:after="0"/>
+            </w:pPr>
+            <w:r/>
+            <w:r>
+              <w:rPr>
+                <w:rFonts w:ascii="Arial Unicode MS" w:hAnsi="Arial Unicode MS" w:eastAsia="Arial Unicode MS" w:cs="Arial Unicode MS"/>
+                <w:b w:val="0"/>
+                <w:color w:val="25313B"/>
+                <w:sz w:val="18"/>
+              </w:rPr>
+              <w:t>【业务提供 / WorkBuddy】</w:t>
+            </w:r>
+          </w:p>
+        </w:tc>
+        <w:tc>
+          <w:tcPr>
+            <w:tcW w:type="dxa" w:w="2750"/>
+            <w:tcMar>
+              <w:top w:w="80" w:type="dxa"/>
+              <w:start w:w="120" w:type="dxa"/>
+              <w:bottom w:w="80" w:type="dxa"/>
+              <w:end w:w="120" w:type="dxa"/>
+            </w:tcMar>
+            <w:vAlign w:val="center"/>
+          </w:tcPr>
+          <w:p>
+            <w:pPr>
+              <w:spacing w:after="0"/>
+            </w:pPr>
+            <w:r/>
+            <w:r>
+              <w:rPr>
+                <w:rFonts w:ascii="Arial Unicode MS" w:hAnsi="Arial Unicode MS" w:eastAsia="Arial Unicode MS" w:cs="Arial Unicode MS"/>
+                <w:b w:val="0"/>
+                <w:color w:val="25313B"/>
+                <w:sz w:val="18"/>
+              </w:rPr>
+              <w:t>【来源、授权人、范围】</w:t>
+            </w:r>
+          </w:p>
+        </w:tc>
+        <w:tc>
+          <w:tcPr>
+            <w:tcW w:type="dxa" w:w="3010"/>
+            <w:tcMar>
+              <w:top w:w="80" w:type="dxa"/>
+              <w:start w:w="120" w:type="dxa"/>
+              <w:bottom w:w="80" w:type="dxa"/>
+              <w:end w:w="120" w:type="dxa"/>
+            </w:tcMar>
+            <w:vAlign w:val="center"/>
+          </w:tcPr>
+          <w:p>
+            <w:pPr>
+              <w:spacing w:after="0"/>
+            </w:pPr>
+            <w:r/>
+            <w:r>
+              <w:rPr>
+                <w:rFonts w:ascii="Arial Unicode MS" w:hAnsi="Arial Unicode MS" w:eastAsia="Arial Unicode MS" w:cs="Arial Unicode MS"/>
+                <w:b w:val="0"/>
+                <w:color w:val="25313B"/>
+                <w:sz w:val="18"/>
+              </w:rPr>
+              <w:t>【关联哪段内容】</w:t>
+            </w:r>
+          </w:p>
+        </w:tc>
+      </w:tr>
+      <w:tr>
+        <w:trPr>
+          <w:cantSplit/>
+        </w:trPr>
+        <w:tc>
+          <w:tcPr>
+            <w:tcW w:type="dxa" w:w="1850"/>
+            <w:tcMar>
+              <w:top w:w="80" w:type="dxa"/>
+              <w:start w:w="120" w:type="dxa"/>
+              <w:bottom w:w="80" w:type="dxa"/>
+              <w:end w:w="120" w:type="dxa"/>
+            </w:tcMar>
+            <w:vAlign w:val="center"/>
+          </w:tcPr>
+          <w:p>
+            <w:pPr>
+              <w:spacing w:after="0"/>
+            </w:pPr>
+            <w:r/>
+            <w:r>
+              <w:rPr>
+                <w:rFonts w:ascii="Arial Unicode MS" w:hAnsi="Arial Unicode MS" w:eastAsia="Arial Unicode MS" w:cs="Arial Unicode MS"/>
+                <w:b w:val="0"/>
+                <w:color w:val="25313B"/>
+                <w:sz w:val="18"/>
+              </w:rPr>
+              <w:t>【素材名称】</w:t>
+            </w:r>
+          </w:p>
+        </w:tc>
+        <w:tc>
+          <w:tcPr>
+            <w:tcW w:type="dxa" w:w="1750"/>
+            <w:tcMar>
+              <w:top w:w="80" w:type="dxa"/>
+              <w:start w:w="120" w:type="dxa"/>
+              <w:bottom w:w="80" w:type="dxa"/>
+              <w:end w:w="120" w:type="dxa"/>
+            </w:tcMar>
+            <w:vAlign w:val="center"/>
+          </w:tcPr>
+          <w:p>
+            <w:pPr>
+              <w:spacing w:after="0"/>
+            </w:pPr>
+            <w:r/>
+            <w:r>
+              <w:rPr>
+                <w:rFonts w:ascii="Arial Unicode MS" w:hAnsi="Arial Unicode MS" w:eastAsia="Arial Unicode MS" w:cs="Arial Unicode MS"/>
+                <w:b w:val="0"/>
+                <w:color w:val="25313B"/>
+                <w:sz w:val="18"/>
+              </w:rPr>
+              <w:t>【业务提供 / WorkBuddy】</w:t>
+            </w:r>
+          </w:p>
+        </w:tc>
+        <w:tc>
+          <w:tcPr>
+            <w:tcW w:type="dxa" w:w="2750"/>
+            <w:tcMar>
+              <w:top w:w="80" w:type="dxa"/>
+              <w:start w:w="120" w:type="dxa"/>
+              <w:bottom w:w="80" w:type="dxa"/>
+              <w:end w:w="120" w:type="dxa"/>
+            </w:tcMar>
+            <w:vAlign w:val="center"/>
+          </w:tcPr>
+          <w:p>
+            <w:pPr>
+              <w:spacing w:after="0"/>
+            </w:pPr>
+            <w:r/>
+            <w:r>
+              <w:rPr>
+                <w:rFonts w:ascii="Arial Unicode MS" w:hAnsi="Arial Unicode MS" w:eastAsia="Arial Unicode MS" w:cs="Arial Unicode MS"/>
+                <w:b w:val="0"/>
+                <w:color w:val="25313B"/>
+                <w:sz w:val="18"/>
+              </w:rPr>
+              <w:t>【来源、授权人、范围】</w:t>
+            </w:r>
+          </w:p>
+        </w:tc>
+        <w:tc>
+          <w:tcPr>
+            <w:tcW w:type="dxa" w:w="3010"/>
+            <w:tcMar>
+              <w:top w:w="80" w:type="dxa"/>
+              <w:start w:w="120" w:type="dxa"/>
+              <w:bottom w:w="80" w:type="dxa"/>
+              <w:end w:w="120" w:type="dxa"/>
+            </w:tcMar>
+            <w:vAlign w:val="center"/>
+          </w:tcPr>
+          <w:p>
+            <w:pPr>
+              <w:spacing w:after="0"/>
+            </w:pPr>
+            <w:r/>
+            <w:r>
+              <w:rPr>
+                <w:rFonts w:ascii="Arial Unicode MS" w:hAnsi="Arial Unicode MS" w:eastAsia="Arial Unicode MS" w:cs="Arial Unicode MS"/>
+                <w:b w:val="0"/>
+                <w:color w:val="25313B"/>
+                <w:sz w:val="18"/>
+              </w:rPr>
+              <w:t>【关联哪段内容】</w:t>
+            </w:r>
+          </w:p>
+        </w:tc>
+      </w:tr>
+      <w:tr>
+        <w:trPr>
+          <w:cantSplit/>
+        </w:trPr>
+        <w:tc>
+          <w:tcPr>
+            <w:tcW w:type="dxa" w:w="1850"/>
+            <w:tcMar>
+              <w:top w:w="80" w:type="dxa"/>
+              <w:start w:w="120" w:type="dxa"/>
+              <w:bottom w:w="80" w:type="dxa"/>
+              <w:end w:w="120" w:type="dxa"/>
+            </w:tcMar>
+            <w:vAlign w:val="center"/>
+          </w:tcPr>
+          <w:p>
+            <w:pPr>
+              <w:spacing w:after="0"/>
+            </w:pPr>
+            <w:r/>
+            <w:r>
+              <w:rPr>
+                <w:rFonts w:ascii="Arial Unicode MS" w:hAnsi="Arial Unicode MS" w:eastAsia="Arial Unicode MS" w:cs="Arial Unicode MS"/>
+                <w:b w:val="0"/>
+                <w:color w:val="25313B"/>
+                <w:sz w:val="18"/>
+              </w:rPr>
+              <w:t>【素材名称】</w:t>
+            </w:r>
+          </w:p>
+        </w:tc>
+        <w:tc>
+          <w:tcPr>
+            <w:tcW w:type="dxa" w:w="1750"/>
+            <w:tcMar>
+              <w:top w:w="80" w:type="dxa"/>
+              <w:start w:w="120" w:type="dxa"/>
+              <w:bottom w:w="80" w:type="dxa"/>
+              <w:end w:w="120" w:type="dxa"/>
+            </w:tcMar>
+            <w:vAlign w:val="center"/>
+          </w:tcPr>
+          <w:p>
+            <w:pPr>
+              <w:spacing w:after="0"/>
+            </w:pPr>
+            <w:r/>
+            <w:r>
+              <w:rPr>
+                <w:rFonts w:ascii="Arial Unicode MS" w:hAnsi="Arial Unicode MS" w:eastAsia="Arial Unicode MS" w:cs="Arial Unicode MS"/>
+                <w:b w:val="0"/>
+                <w:color w:val="25313B"/>
+                <w:sz w:val="18"/>
+              </w:rPr>
+              <w:t>【业务提供 / WorkBuddy】</w:t>
+            </w:r>
+          </w:p>
+        </w:tc>
+        <w:tc>
+          <w:tcPr>
+            <w:tcW w:type="dxa" w:w="2750"/>
+            <w:tcMar>
+              <w:top w:w="80" w:type="dxa"/>
+              <w:start w:w="120" w:type="dxa"/>
+              <w:bottom w:w="80" w:type="dxa"/>
+              <w:end w:w="120" w:type="dxa"/>
+            </w:tcMar>
+            <w:vAlign w:val="center"/>
+          </w:tcPr>
+          <w:p>
+            <w:pPr>
+              <w:spacing w:after="0"/>
+            </w:pPr>
+            <w:r/>
+            <w:r>
+              <w:rPr>
+                <w:rFonts w:ascii="Arial Unicode MS" w:hAnsi="Arial Unicode MS" w:eastAsia="Arial Unicode MS" w:cs="Arial Unicode MS"/>
+                <w:b w:val="0"/>
+                <w:color w:val="25313B"/>
+                <w:sz w:val="18"/>
+              </w:rPr>
+              <w:t>【来源、授权人、范围】</w:t>
+            </w:r>
+          </w:p>
+        </w:tc>
+        <w:tc>
+          <w:tcPr>
+            <w:tcW w:type="dxa" w:w="3010"/>
+            <w:tcMar>
+              <w:top w:w="80" w:type="dxa"/>
+              <w:start w:w="120" w:type="dxa"/>
+              <w:bottom w:w="80" w:type="dxa"/>
+              <w:end w:w="120" w:type="dxa"/>
+            </w:tcMar>
+            <w:vAlign w:val="center"/>
+          </w:tcPr>
+          <w:p>
+            <w:pPr>
+              <w:spacing w:after="0"/>
+            </w:pPr>
+            <w:r/>
+            <w:r>
+              <w:rPr>
+                <w:rFonts w:ascii="Arial Unicode MS" w:hAnsi="Arial Unicode MS" w:eastAsia="Arial Unicode MS" w:cs="Arial Unicode MS"/>
+                <w:b w:val="0"/>
+                <w:color w:val="25313B"/>
+                <w:sz w:val="18"/>
+              </w:rPr>
+              <w:t>【关联哪段内容】</w:t>
+            </w:r>
+          </w:p>
+        </w:tc>
+      </w:tr>
+      <w:tr>
+        <w:trPr>
+          <w:cantSplit/>
+        </w:trPr>
+        <w:tc>
+          <w:tcPr>
+            <w:tcW w:type="dxa" w:w="1850"/>
+            <w:tcMar>
+              <w:top w:w="80" w:type="dxa"/>
+              <w:start w:w="120" w:type="dxa"/>
+              <w:bottom w:w="80" w:type="dxa"/>
+              <w:end w:w="120" w:type="dxa"/>
+            </w:tcMar>
+            <w:vAlign w:val="center"/>
+          </w:tcPr>
+          <w:p>
+            <w:pPr>
+              <w:spacing w:after="0"/>
+            </w:pPr>
+            <w:r/>
+            <w:r>
+              <w:rPr>
+                <w:rFonts w:ascii="Arial Unicode MS" w:hAnsi="Arial Unicode MS" w:eastAsia="Arial Unicode MS" w:cs="Arial Unicode MS"/>
+                <w:b w:val="0"/>
+                <w:color w:val="25313B"/>
+                <w:sz w:val="18"/>
+              </w:rPr>
+              <w:t>【素材名称】</w:t>
+            </w:r>
+          </w:p>
+        </w:tc>
+        <w:tc>
+          <w:tcPr>
+            <w:tcW w:type="dxa" w:w="1750"/>
+            <w:tcMar>
+              <w:top w:w="80" w:type="dxa"/>
+              <w:start w:w="120" w:type="dxa"/>
+              <w:bottom w:w="80" w:type="dxa"/>
+              <w:end w:w="120" w:type="dxa"/>
+            </w:tcMar>
+            <w:vAlign w:val="center"/>
+          </w:tcPr>
+          <w:p>
+            <w:pPr>
+              <w:spacing w:after="0"/>
+            </w:pPr>
+            <w:r/>
+            <w:r>
+              <w:rPr>
+                <w:rFonts w:ascii="Arial Unicode MS" w:hAnsi="Arial Unicode MS" w:eastAsia="Arial Unicode MS" w:cs="Arial Unicode MS"/>
+                <w:b w:val="0"/>
+                <w:color w:val="25313B"/>
+                <w:sz w:val="18"/>
+              </w:rPr>
+              <w:t>【业务提供 / WorkBuddy】</w:t>
+            </w:r>
+          </w:p>
+        </w:tc>
+        <w:tc>
+          <w:tcPr>
+            <w:tcW w:type="dxa" w:w="2750"/>
+            <w:tcMar>
+              <w:top w:w="80" w:type="dxa"/>
+              <w:start w:w="120" w:type="dxa"/>
+              <w:bottom w:w="80" w:type="dxa"/>
+              <w:end w:w="120" w:type="dxa"/>
+            </w:tcMar>
+            <w:vAlign w:val="center"/>
+          </w:tcPr>
+          <w:p>
+            <w:pPr>
+              <w:spacing w:after="0"/>
+            </w:pPr>
+            <w:r/>
+            <w:r>
+              <w:rPr>
+                <w:rFonts w:ascii="Arial Unicode MS" w:hAnsi="Arial Unicode MS" w:eastAsia="Arial Unicode MS" w:cs="Arial Unicode MS"/>
+                <w:b w:val="0"/>
+                <w:color w:val="25313B"/>
+                <w:sz w:val="18"/>
+              </w:rPr>
+              <w:t>【来源、授权人、范围】</w:t>
+            </w:r>
+          </w:p>
+        </w:tc>
+        <w:tc>
+          <w:tcPr>
+            <w:tcW w:type="dxa" w:w="3010"/>
+            <w:tcMar>
+              <w:top w:w="80" w:type="dxa"/>
+              <w:start w:w="120" w:type="dxa"/>
+              <w:bottom w:w="80" w:type="dxa"/>
+              <w:end w:w="120" w:type="dxa"/>
+            </w:tcMar>
+            <w:vAlign w:val="center"/>
+          </w:tcPr>
+          <w:p>
+            <w:pPr>
+              <w:spacing w:after="0"/>
+            </w:pPr>
+            <w:r/>
+            <w:r>
+              <w:rPr>
+                <w:rFonts w:ascii="Arial Unicode MS" w:hAnsi="Arial Unicode MS" w:eastAsia="Arial Unicode MS" w:cs="Arial Unicode MS"/>
+                <w:b w:val="0"/>
+                <w:color w:val="25313B"/>
+                <w:sz w:val="18"/>
+              </w:rPr>
+              <w:t>【关联哪段内容】</w:t>
+            </w:r>
+          </w:p>
+        </w:tc>
+      </w:tr>
+    </w:tbl>
+    <w:p>
+      <w:pPr>
+        <w:pStyle w:val="Heading2"/>
+      </w:pPr>
+      <w:r>
+        <w:t>复制给 WorkBuddy 的启动口令</w:t>
+      </w:r>
+    </w:p>
+    <w:tbl>
+      <w:tblPr>
+        <w:tblW w:type="dxa" w:w="9360"/>
+        <w:tblLayout w:type="fixed"/>
+        <w:tblLook w:firstColumn="1" w:firstRow="1" w:lastColumn="0" w:lastRow="0" w:noHBand="0" w:noVBand="1" w:val="04A0"/>
+        <w:tblInd w:w="120" w:type="dxa"/>
+      </w:tblPr>
+      <w:tblGrid>
+        <w:gridCol w:w="9360"/>
+      </w:tblGrid>
+      <w:tr>
+        <w:trPr>
+          <w:cantSplit/>
+        </w:trPr>
+        <w:tc>
+          <w:tcPr>
+            <w:tcW w:type="dxa" w:w="9360"/>
+            <w:tcMar>
+              <w:top w:w="80" w:type="dxa"/>
+              <w:start w:w="120" w:type="dxa"/>
+              <w:bottom w:w="80" w:type="dxa"/>
+              <w:end w:w="120" w:type="dxa"/>
+            </w:tcMar>
+            <w:vAlign w:val="center"/>
+            <w:shd w:fill="EAF3F8"/>
+          </w:tcPr>
+          <w:p>
+            <w:pPr>
+              <w:spacing w:after="0"/>
+            </w:pPr>
+            <w:r>
+              <w:rPr>
+                <w:rFonts w:ascii="Arial Unicode MS" w:hAnsi="Arial Unicode MS" w:eastAsia="Arial Unicode MS" w:cs="Arial Unicode MS"/>
+                <w:b/>
+                <w:color w:val="1F4661"/>
+                <w:sz w:val="21"/>
+              </w:rPr>
+              <w:t xml:space="preserve">启动口令  </w:t>
+            </w:r>
+            <w:r>
+              <w:rPr>
+                <w:rFonts w:ascii="Arial Unicode MS" w:hAnsi="Arial Unicode MS" w:eastAsia="Arial Unicode MS" w:cs="Arial Unicode MS"/>
+                <w:b w:val="0"/>
+                <w:color w:val="25313B"/>
+                <w:sz w:val="21"/>
+              </w:rPr>
+              <w:t>我要做一份商品培训 PPT。交付目标、业务内容和素材见这份 Word。请根据内容选择合适的中文页签与页序，先给我内容初稿、待补字段、每个页签的能力来源解释、素材分工和一套统一视觉方案。在我确认内容、视觉和正式商品图授权前，不要生成正式 PPTX。我不填写内部 JSON 或页型 ID。</w:t>
+            </w:r>
+          </w:p>
+        </w:tc>
+      </w:tr>
+    </w:tbl>
+    <w:p>
+      <w:pPr>
+        <w:spacing w:after="0"/>
+      </w:pPr>
+    </w:p>
+    <w:p>
+      <w:pPr>
+        <w:spacing w:after="60"/>
+      </w:pPr>
+      <w:r>
+        <w:t>□ 目标、对象和使用场景已说明</w:t>
+      </w:r>
+    </w:p>
+    <w:p>
+      <w:pPr>
+        <w:spacing w:after="60"/>
+      </w:pPr>
+      <w:r>
+        <w:t>□ 所有未确认内容已标记待补</w:t>
+      </w:r>
+    </w:p>
+    <w:p>
+      <w:pPr>
+        <w:spacing w:after="60"/>
+      </w:pPr>
+      <w:r>
+        <w:t>□ 正式包装 / Logo / 人物 / 证据素材均有来源与授权</w:t>
+      </w:r>
+    </w:p>
+    <w:p>
+      <w:pPr>
+        <w:spacing w:after="60"/>
+      </w:pPr>
+      <w:r>
+        <w:t>□ 已要求先看中文页签大纲、来源解释和单一视觉方案</w:t>
       </w:r>
     </w:p>
     <w:sectPr>
-      <w:footerReference w:type="default" r:id="rId9"/>
+      <w:headerReference w:type="default" r:id="rId9"/>
+      <w:footerReference w:type="default" r:id="rId10"/>
       <w:pgSz w:w="12240" w:h="15840"/>
       <w:pgMar w:top="1440" w:right="1440" w:bottom="1440" w:left="1440" w:header="708" w:footer="708" w:gutter="0"/>
       <w:cols w:space="720"/>
@@ -249,32 +2167,39 @@
   <w:p>
     <w:pPr>
       <w:pStyle w:val="Footer"/>
-      <w:jc w:val="right"/>
+      <w:jc w:val="center"/>
     </w:pPr>
     <w:r>
       <w:rPr>
-        <w:rFonts w:ascii="PingFang SC" w:hAnsi="PingFang SC" w:eastAsia="PingFang SC"/>
+        <w:rFonts w:ascii="Arial Unicode MS" w:hAnsi="Arial Unicode MS" w:eastAsia="Arial Unicode MS" w:cs="Arial Unicode MS"/>
         <w:b w:val="0"/>
-        <w:i w:val="0"/>
-        <w:color w:val="606B76"/>
-        <w:sz w:val="18"/>
-      </w:rPr>
-      <w:t>一份 Word 对应一个课件主题｜</w:t>
-    </w:r>
-    <w:r>
-      <w:rPr>
-        <w:rFonts w:ascii="PingFang SC" w:hAnsi="PingFang SC" w:eastAsia="PingFang SC"/>
-        <w:b w:val="0"/>
-        <w:i w:val="0"/>
-        <w:color w:val="606B76"/>
-        <w:sz w:val="18"/>
-      </w:rPr>
-      <w:fldChar w:fldCharType="begin"/>
-      <w:instrText xml:space="preserve"> PAGE </w:instrText>
-      <w:fldChar w:fldCharType="end"/>
+        <w:color w:val="677682"/>
+        <w:sz w:val="17"/>
+      </w:rPr>
+      <w:t>业务提交用｜灵活构件商品培训 PPT</w:t>
     </w:r>
   </w:p>
 </w:ftr>
+</file>
+
+<file path=word/header1.xml><?xml version="1.0" encoding="utf-8"?>
+<w:hdr xmlns:m="http://schemas.openxmlformats.org/officeDocument/2006/math" xmlns:mc="http://schemas.openxmlformats.org/markup-compatibility/2006" xmlns:mo="http://schemas.microsoft.com/office/mac/office/2008/main" xmlns:mv="urn:schemas-microsoft-com:mac:vml" xmlns:o="urn:schemas-microsoft-com:office:office" xmlns:r="http://schemas.openxmlformats.org/officeDocument/2006/relationships" xmlns:v="urn:schemas-microsoft-com:vml" xmlns:w10="urn:schemas-microsoft-com:office:word" xmlns:w14="http://schemas.microsoft.com/office/word/2010/wordml" xmlns:w="http://schemas.openxmlformats.org/wordprocessingml/2006/main" xmlns:wne="http://schemas.microsoft.com/office/word/2006/wordml" xmlns:wp14="http://schemas.microsoft.com/office/word/2010/wordprocessingDrawing" xmlns:wp="http://schemas.openxmlformats.org/drawingml/2006/wordprocessingDrawing" xmlns:wpc="http://schemas.microsoft.com/office/word/2010/wordprocessingCanvas" xmlns:wpg="http://schemas.microsoft.com/office/word/2010/wordprocessingGroup" xmlns:wpi="http://schemas.microsoft.com/office/word/2010/wordprocessingInk" xmlns:wps="http://schemas.microsoft.com/office/word/2010/wordprocessingShape" mc:Ignorable="w14 wp14">
+  <w:p>
+    <w:pPr>
+      <w:pStyle w:val="Header"/>
+      <w:jc w:val="right"/>
+    </w:pPr>
+    <w:r>
+      <w:rPr>
+        <w:rFonts w:ascii="Arial Unicode MS" w:hAnsi="Arial Unicode MS" w:eastAsia="Arial Unicode MS" w:cs="Arial Unicode MS"/>
+        <w:b w:val="0"/>
+        <w:color w:val="677682"/>
+        <w:sz w:val="17"/>
+      </w:rPr>
+      <w:t>空白模板</w:t>
+    </w:r>
+  </w:p>
+</w:hdr>
 </file>
 
 <file path=word/numbering.xml><?xml version="1.0" encoding="utf-8"?>
@@ -644,8 +2569,8 @@
       <w:spacing w:after="120" w:line="300" w:lineRule="auto"/>
     </w:pPr>
     <w:rPr>
-      <w:rFonts w:ascii="PingFang SC" w:hAnsi="PingFang SC" w:eastAsia="PingFang SC"/>
-      <w:color w:val="1A2026"/>
+      <w:rFonts w:ascii="Arial Unicode MS" w:hAnsi="Arial Unicode MS" w:eastAsia="Arial Unicode MS" w:cs="Arial Unicode MS"/>
+      <w:color w:val="25313B"/>
       <w:sz w:val="22"/>
     </w:rPr>
   </w:style>
@@ -708,10 +2633,10 @@
       <w:outlineLvl w:val="0"/>
     </w:pPr>
     <w:rPr>
-      <w:rFonts w:asciiTheme="majorHAnsi" w:eastAsiaTheme="majorEastAsia" w:hAnsiTheme="majorHAnsi" w:cstheme="majorBidi" w:ascii="PingFang SC" w:hAnsi="PingFang SC" w:eastAsia="PingFang SC"/>
+      <w:rFonts w:asciiTheme="majorHAnsi" w:eastAsiaTheme="majorEastAsia" w:hAnsiTheme="majorHAnsi" w:cstheme="majorBidi" w:ascii="Arial Unicode MS" w:hAnsi="Arial Unicode MS" w:eastAsia="Arial Unicode MS" w:cs="Arial Unicode MS"/>
       <w:b/>
       <w:bCs/>
-      <w:color w:val="2E74B5"/>
+      <w:color w:val="2F5D7C"/>
       <w:sz w:val="32"/>
       <w:szCs w:val="28"/>
     </w:rPr>
@@ -728,14 +2653,14 @@
     <w:pPr>
       <w:keepNext/>
       <w:keepLines/>
-      <w:spacing w:before="200" w:after="0"/>
+      <w:spacing w:before="280" w:after="140"/>
       <w:outlineLvl w:val="1"/>
     </w:pPr>
     <w:rPr>
-      <w:rFonts w:asciiTheme="majorHAnsi" w:eastAsiaTheme="majorEastAsia" w:hAnsiTheme="majorHAnsi" w:cstheme="majorBidi"/>
+      <w:rFonts w:asciiTheme="majorHAnsi" w:eastAsiaTheme="majorEastAsia" w:hAnsiTheme="majorHAnsi" w:cstheme="majorBidi" w:ascii="Arial Unicode MS" w:hAnsi="Arial Unicode MS" w:eastAsia="Arial Unicode MS" w:cs="Arial Unicode MS"/>
       <w:b/>
       <w:bCs/>
-      <w:color w:val="4F81BD" w:themeColor="accent1"/>
+      <w:color w:val="1F4661"/>
       <w:sz w:val="26"/>
       <w:szCs w:val="26"/>
     </w:rPr>
@@ -752,14 +2677,15 @@
     <w:pPr>
       <w:keepNext/>
       <w:keepLines/>
-      <w:spacing w:before="200" w:after="0"/>
+      <w:spacing w:before="200" w:after="100"/>
       <w:outlineLvl w:val="2"/>
     </w:pPr>
     <w:rPr>
-      <w:rFonts w:asciiTheme="majorHAnsi" w:eastAsiaTheme="majorEastAsia" w:hAnsiTheme="majorHAnsi" w:cstheme="majorBidi"/>
+      <w:rFonts w:asciiTheme="majorHAnsi" w:eastAsiaTheme="majorEastAsia" w:hAnsiTheme="majorHAnsi" w:cstheme="majorBidi" w:ascii="Arial Unicode MS" w:hAnsi="Arial Unicode MS" w:eastAsia="Arial Unicode MS" w:cs="Arial Unicode MS"/>
       <w:b/>
       <w:bCs/>
-      <w:color w:val="4F81BD" w:themeColor="accent1"/>
+      <w:color w:val="1F4661"/>
+      <w:sz w:val="24"/>
     </w:rPr>
   </w:style>
   <w:style w:type="paragraph" w:styleId="Heading4">
@@ -12330,18 +14256,6 @@
         <w:shd w:val="clear" w:color="auto" w:fill="FBCAA2" w:themeFill="accent6" w:themeFillTint="7F"/>
       </w:tcPr>
     </w:tblStylePr>
-  </w:style>
-  <w:style w:type="paragraph" w:customStyle="1" w:styleId="UniversalIgnore">
-    <w:name w:val="Universal Ignore"/>
-    <w:basedOn w:val="Normal"/>
-    <w:pPr>
-      <w:spacing w:after="100" w:line="300" w:lineRule="auto"/>
-    </w:pPr>
-    <w:rPr>
-      <w:rFonts w:ascii="PingFang SC" w:hAnsi="PingFang SC" w:eastAsia="PingFang SC"/>
-      <w:color w:val="606B76"/>
-      <w:sz w:val="19"/>
-    </w:rPr>
   </w:style>
 </w:styles>
 </file>

</xml_diff>